<commit_message>
Update Md. Nayamul Islam's CV documents
Revised both the DOCX and PDF versions of Md. Nayamul Islam's CV. The updates may include content or formatting changes to the curriculum vitae.
</commit_message>
<xml_diff>
--- a/CV/Md. Nayamul Islam .docx
+++ b/CV/Md. Nayamul Islam .docx
@@ -2,6 +2,7 @@
 <file path=word/document.xml><?xml version="1.0" encoding="utf-8"?>
 <w:document xmlns:wpc="http://schemas.microsoft.com/office/word/2010/wordprocessingCanvas" xmlns:cx="http://schemas.microsoft.com/office/drawing/2014/chartex" xmlns:cx1="http://schemas.microsoft.com/office/drawing/2015/9/8/chartex" xmlns:cx2="http://schemas.microsoft.com/office/drawing/2015/10/21/chartex" xmlns:cx3="http://schemas.microsoft.com/office/drawing/2016/5/9/chartex" xmlns:cx4="http://schemas.microsoft.com/office/drawing/2016/5/10/chartex" xmlns:cx5="http://schemas.microsoft.com/office/drawing/2016/5/11/chartex" xmlns:cx6="http://schemas.microsoft.com/office/drawing/2016/5/12/chartex" xmlns:cx7="http://schemas.microsoft.com/office/drawing/2016/5/13/chartex" xmlns:cx8="http://schemas.microsoft.com/office/drawing/2016/5/14/chartex" xmlns:mc="http://schemas.openxmlformats.org/markup-compatibility/2006" xmlns:aink="http://schemas.microsoft.com/office/drawing/2016/ink" xmlns:am3d="http://schemas.microsoft.com/office/drawing/2017/model3d" xmlns:o="urn:schemas-microsoft-com:office:office" xmlns:oel="http://schemas.microsoft.com/office/2019/extlst" xmlns:r="http://schemas.openxmlformats.org/officeDocument/2006/relationships" xmlns:m="http://schemas.openxmlformats.org/officeDocument/2006/math" xmlns:v="urn:schemas-microsoft-com:vml" xmlns:wp14="http://schemas.microsoft.com/office/word/2010/wordprocessingDrawing" xmlns:wp="http://schemas.openxmlformats.org/drawingml/2006/wordprocessingDrawing" xmlns:w10="urn:schemas-microsoft-com:office:word" xmlns:w="http://schemas.openxmlformats.org/wordprocessingml/2006/main" xmlns:w14="http://schemas.microsoft.com/office/word/2010/wordml" xmlns:w15="http://schemas.microsoft.com/office/word/2012/wordml" xmlns:w16cex="http://schemas.microsoft.com/office/word/2018/wordml/cex" xmlns:w16cid="http://schemas.microsoft.com/office/word/2016/wordml/cid" xmlns:w16="http://schemas.microsoft.com/office/word/2018/wordml" xmlns:w16du="http://schemas.microsoft.com/office/word/2023/wordml/word16du" xmlns:w16sdtdh="http://schemas.microsoft.com/office/word/2020/wordml/sdtdatahash" xmlns:w16sdtfl="http://schemas.microsoft.com/office/word/2024/wordml/sdtformatlock" xmlns:w16se="http://schemas.microsoft.com/office/word/2015/wordml/symex" xmlns:wpg="http://schemas.microsoft.com/office/word/2010/wordprocessingGroup" xmlns:wpi="http://schemas.microsoft.com/office/word/2010/wordprocessingInk" xmlns:wne="http://schemas.microsoft.com/office/word/2006/wordml" xmlns:wps="http://schemas.microsoft.com/office/word/2010/wordprocessingShape" mc:Ignorable="w14 w15 w16se w16cid w16 w16cex w16sdtdh w16sdtfl w16du wp14">
   <w:body>
+    <w:bookmarkStart w:id="0" w:name="_Hlk190432030"/>
     <w:p>
       <w:pPr>
         <w:rPr>
@@ -12,7 +13,6 @@
           <w:szCs w:val="36"/>
         </w:rPr>
       </w:pPr>
-      <w:bookmarkStart w:id="0" w:name="_Hlk190432030"/>
       <w:r>
         <w:rPr>
           <w:rFonts w:ascii="Times New Roman" w:hAnsi="Times New Roman" w:cs="Times New Roman"/>
@@ -350,14 +350,51 @@
         <w:rPr>
           <w:rFonts w:ascii="Times New Roman" w:hAnsi="Times New Roman" w:cs="Times New Roman"/>
         </w:rPr>
-        <w:t xml:space="preserve"> +8801323276407 / 01784991229 |</w:t>
-      </w:r>
-      <w:r>
-        <w:rPr>
-          <w:rFonts w:ascii="Times New Roman" w:hAnsi="Times New Roman" w:cs="Times New Roman"/>
-        </w:rPr>
         <w:t xml:space="preserve"> </w:t>
       </w:r>
+      <w:hyperlink r:id="rId14" w:history="1">
+        <w:r>
+          <w:rPr>
+            <w:rStyle w:val="Hyperlink"/>
+            <w:rFonts w:ascii="Times New Roman" w:hAnsi="Times New Roman" w:cs="Times New Roman"/>
+          </w:rPr>
+          <w:t>+8801323276407</w:t>
+        </w:r>
+      </w:hyperlink>
+      <w:r>
+        <w:rPr>
+          <w:rFonts w:ascii="Times New Roman" w:hAnsi="Times New Roman" w:cs="Times New Roman"/>
+        </w:rPr>
+        <w:t xml:space="preserve"> / </w:t>
+      </w:r>
+      <w:hyperlink r:id="rId15" w:history="1">
+        <w:r>
+          <w:rPr>
+            <w:rStyle w:val="Hyperlink"/>
+            <w:rFonts w:ascii="Times New Roman" w:hAnsi="Times New Roman" w:cs="Times New Roman"/>
+          </w:rPr>
+          <w:t>+88</w:t>
+        </w:r>
+        <w:r>
+          <w:rPr>
+            <w:rStyle w:val="Hyperlink"/>
+            <w:rFonts w:ascii="Times New Roman" w:hAnsi="Times New Roman" w:cs="Times New Roman"/>
+          </w:rPr>
+          <w:t>01784991229</w:t>
+        </w:r>
+      </w:hyperlink>
+      <w:r>
+        <w:rPr>
+          <w:rFonts w:ascii="Times New Roman" w:hAnsi="Times New Roman" w:cs="Times New Roman"/>
+        </w:rPr>
+        <w:t xml:space="preserve"> |</w:t>
+      </w:r>
+      <w:r>
+        <w:rPr>
+          <w:rFonts w:ascii="Times New Roman" w:hAnsi="Times New Roman" w:cs="Times New Roman"/>
+        </w:rPr>
+        <w:t xml:space="preserve"> </w:t>
+      </w:r>
       <w:r>
         <w:rPr>
           <w:rFonts w:ascii="Segoe UI Emoji" w:hAnsi="Segoe UI Emoji" w:cs="Segoe UI Emoji"/>
@@ -368,7 +405,22 @@
         <w:rPr>
           <w:rFonts w:ascii="Times New Roman" w:hAnsi="Times New Roman" w:cs="Times New Roman"/>
         </w:rPr>
-        <w:t xml:space="preserve"> nayamulislam@gmail.com |</w:t>
+        <w:t xml:space="preserve"> </w:t>
+      </w:r>
+      <w:hyperlink r:id="rId16" w:history="1">
+        <w:r>
+          <w:rPr>
+            <w:rStyle w:val="Hyperlink"/>
+            <w:rFonts w:ascii="Times New Roman" w:hAnsi="Times New Roman" w:cs="Times New Roman"/>
+          </w:rPr>
+          <w:t>nayamulislam@gmail.com</w:t>
+        </w:r>
+      </w:hyperlink>
+      <w:r>
+        <w:rPr>
+          <w:rFonts w:ascii="Times New Roman" w:hAnsi="Times New Roman" w:cs="Times New Roman"/>
+        </w:rPr>
+        <w:t xml:space="preserve"> |</w:t>
       </w:r>
     </w:p>
     <w:p>
@@ -419,7 +471,7 @@
         </w:rPr>
         <w:t xml:space="preserve"> </w:t>
       </w:r>
-      <w:hyperlink r:id="rId14" w:history="1">
+      <w:hyperlink r:id="rId17" w:history="1">
         <w:r>
           <w:rPr>
             <w:rStyle w:val="Hyperlink"/>
@@ -434,7 +486,7 @@
         </w:rPr>
         <w:t xml:space="preserve"> | </w:t>
       </w:r>
-      <w:hyperlink r:id="rId15" w:history="1">
+      <w:hyperlink r:id="rId18" w:history="1">
         <w:r>
           <w:rPr>
             <w:rStyle w:val="Hyperlink"/>
@@ -461,6 +513,7 @@
         <w:pBdr>
           <w:bottom w:val="single" w:sz="4" w:space="1" w:color="auto"/>
         </w:pBdr>
+        <w:spacing w:line="276" w:lineRule="auto"/>
         <w:ind w:left="0" w:firstLine="0"/>
         <w:rPr>
           <w:rFonts w:ascii="Times New Roman" w:hAnsi="Times New Roman" w:cs="Times New Roman"/>
@@ -483,6 +536,7 @@
     </w:p>
     <w:p>
       <w:pPr>
+        <w:spacing w:line="276" w:lineRule="auto"/>
         <w:rPr>
           <w:rFonts w:ascii="Times New Roman" w:hAnsi="Times New Roman" w:cs="Times New Roman"/>
         </w:rPr>
@@ -490,6 +544,7 @@
     </w:p>
     <w:p>
       <w:pPr>
+        <w:spacing w:line="276" w:lineRule="auto"/>
         <w:rPr>
           <w:rFonts w:ascii="Times New Roman" w:hAnsi="Times New Roman" w:cs="Times New Roman"/>
         </w:rPr>
@@ -515,6 +570,7 @@
     </w:p>
     <w:p>
       <w:pPr>
+        <w:spacing w:line="276" w:lineRule="auto"/>
         <w:rPr>
           <w:rFonts w:ascii="Times New Roman" w:hAnsi="Times New Roman" w:cs="Times New Roman"/>
         </w:rPr>
@@ -526,6 +582,7 @@
         <w:pBdr>
           <w:bottom w:val="single" w:sz="4" w:space="1" w:color="auto"/>
         </w:pBdr>
+        <w:spacing w:line="276" w:lineRule="auto"/>
         <w:ind w:left="0" w:firstLine="0"/>
         <w:rPr>
           <w:rFonts w:ascii="Times New Roman" w:hAnsi="Times New Roman" w:cs="Times New Roman"/>
@@ -558,6 +615,7 @@
     </w:p>
     <w:p>
       <w:pPr>
+        <w:spacing w:line="276" w:lineRule="auto"/>
         <w:rPr>
           <w:rFonts w:ascii="Times New Roman" w:hAnsi="Times New Roman" w:cs="Times New Roman"/>
           <w:b/>
@@ -578,7 +636,7 @@
           <w:b/>
           <w:bCs/>
         </w:rPr>
-        <w:t>Software Developer</w:t>
+        <w:t>Software Engineer (Java)</w:t>
       </w:r>
     </w:p>
     <w:p>
@@ -592,7 +650,7 @@
         <w:rPr>
           <w:rFonts w:ascii="Times New Roman" w:hAnsi="Times New Roman" w:cs="Times New Roman"/>
         </w:rPr>
-        <w:t xml:space="preserve">Telerad Medical Systems Ltd. | </w:t>
+        <w:t>SEBPO Bangladesh</w:t>
       </w:r>
       <w:r>
         <w:rPr>
@@ -600,32 +658,362 @@
           <w:b/>
           <w:bCs/>
         </w:rPr>
-        <w:t>Feb 2025 – Present</w:t>
+        <w:t xml:space="preserve"> </w:t>
+      </w:r>
+      <w:r>
+        <w:rPr>
+          <w:rFonts w:ascii="Times New Roman" w:hAnsi="Times New Roman" w:cs="Times New Roman"/>
+        </w:rPr>
+        <w:t>|</w:t>
+      </w:r>
+      <w:r>
+        <w:rPr>
+          <w:rFonts w:ascii="Times New Roman" w:hAnsi="Times New Roman" w:cs="Times New Roman"/>
+        </w:rPr>
+        <w:t xml:space="preserve"> </w:t>
+      </w:r>
+      <w:r>
+        <w:rPr>
+          <w:rFonts w:ascii="Times New Roman" w:hAnsi="Times New Roman" w:cs="Times New Roman"/>
+          <w:b/>
+          <w:bCs/>
+        </w:rPr>
+        <w:t>15</w:t>
+      </w:r>
+      <w:r>
+        <w:rPr>
+          <w:rFonts w:ascii="Times New Roman" w:hAnsi="Times New Roman" w:cs="Times New Roman"/>
+          <w:b/>
+          <w:bCs/>
+        </w:rPr>
+        <w:t xml:space="preserve"> September 2025</w:t>
+      </w:r>
+      <w:r>
+        <w:rPr>
+          <w:rFonts w:ascii="Times New Roman" w:hAnsi="Times New Roman" w:cs="Times New Roman"/>
+          <w:b/>
+          <w:bCs/>
+        </w:rPr>
+        <w:t xml:space="preserve"> – </w:t>
+      </w:r>
+      <w:r>
+        <w:rPr>
+          <w:rFonts w:ascii="Times New Roman" w:hAnsi="Times New Roman" w:cs="Times New Roman"/>
+          <w:b/>
+          <w:bCs/>
+        </w:rPr>
+        <w:t>Present</w:t>
       </w:r>
     </w:p>
     <w:p>
       <w:pPr>
-        <w:rPr>
-          <w:rFonts w:ascii="Times New Roman" w:hAnsi="Times New Roman" w:cs="Times New Roman"/>
-        </w:rPr>
-      </w:pPr>
-      <w:r>
-        <w:rPr>
-          <w:rFonts w:ascii="Times New Roman" w:hAnsi="Times New Roman" w:cs="Times New Roman"/>
-        </w:rPr>
-        <w:t xml:space="preserve">Currently engaged in the development and maintenance of HMS, ERP, and HIS software systems. </w:t>
-      </w:r>
+        <w:spacing w:line="276" w:lineRule="auto"/>
+        <w:rPr>
+          <w:rFonts w:ascii="Times New Roman" w:hAnsi="Times New Roman" w:cs="Times New Roman"/>
+        </w:rPr>
+      </w:pPr>
     </w:p>
     <w:p>
       <w:pPr>
-        <w:rPr>
-          <w:rFonts w:ascii="Times New Roman" w:hAnsi="Times New Roman" w:cs="Times New Roman"/>
-        </w:rPr>
-      </w:pPr>
+        <w:spacing w:line="276" w:lineRule="auto"/>
+        <w:rPr>
+          <w:rFonts w:ascii="Times New Roman" w:hAnsi="Times New Roman" w:cs="Times New Roman"/>
+          <w:b/>
+          <w:bCs/>
+        </w:rPr>
+      </w:pPr>
+      <w:r>
+        <w:rPr>
+          <w:rFonts w:ascii="Times New Roman" w:hAnsi="Times New Roman" w:cs="Times New Roman"/>
+          <w:b/>
+          <w:bCs/>
+        </w:rPr>
+        <w:t>Key responsibilities include:</w:t>
+      </w:r>
     </w:p>
     <w:p>
       <w:pPr>
-        <w:spacing w:line="360" w:lineRule="auto"/>
+        <w:numPr>
+          <w:ilvl w:val="0"/>
+          <w:numId w:val="50"/>
+        </w:numPr>
+        <w:spacing w:line="276" w:lineRule="auto"/>
+        <w:rPr>
+          <w:rFonts w:ascii="Times New Roman" w:hAnsi="Times New Roman" w:cs="Times New Roman"/>
+        </w:rPr>
+      </w:pPr>
+      <w:r>
+        <w:rPr>
+          <w:rFonts w:ascii="Times New Roman" w:hAnsi="Times New Roman" w:cs="Times New Roman"/>
+        </w:rPr>
+        <w:t xml:space="preserve">Build and maintain </w:t>
+      </w:r>
+      <w:r>
+        <w:rPr>
+          <w:rFonts w:ascii="Times New Roman" w:hAnsi="Times New Roman" w:cs="Times New Roman"/>
+          <w:b/>
+          <w:bCs/>
+        </w:rPr>
+        <w:t>Java/Spring Boot microservices</w:t>
+      </w:r>
+      <w:r>
+        <w:rPr>
+          <w:rFonts w:ascii="Times New Roman" w:hAnsi="Times New Roman" w:cs="Times New Roman"/>
+        </w:rPr>
+        <w:t xml:space="preserve"> for large-scale </w:t>
+      </w:r>
+      <w:r>
+        <w:rPr>
+          <w:rFonts w:ascii="Times New Roman" w:hAnsi="Times New Roman" w:cs="Times New Roman"/>
+          <w:b/>
+          <w:bCs/>
+        </w:rPr>
+        <w:t>data scraping, extraction, and automation</w:t>
+      </w:r>
+      <w:r>
+        <w:rPr>
+          <w:rFonts w:ascii="Times New Roman" w:hAnsi="Times New Roman" w:cs="Times New Roman"/>
+        </w:rPr>
+        <w:t>.</w:t>
+      </w:r>
+    </w:p>
+    <w:p>
+      <w:pPr>
+        <w:numPr>
+          <w:ilvl w:val="0"/>
+          <w:numId w:val="50"/>
+        </w:numPr>
+        <w:spacing w:line="276" w:lineRule="auto"/>
+        <w:rPr>
+          <w:rFonts w:ascii="Times New Roman" w:hAnsi="Times New Roman" w:cs="Times New Roman"/>
+        </w:rPr>
+      </w:pPr>
+      <w:r>
+        <w:rPr>
+          <w:rFonts w:ascii="Times New Roman" w:hAnsi="Times New Roman" w:cs="Times New Roman"/>
+        </w:rPr>
+        <w:t xml:space="preserve">Design and optimize </w:t>
+      </w:r>
+      <w:r>
+        <w:rPr>
+          <w:rFonts w:ascii="Times New Roman" w:hAnsi="Times New Roman" w:cs="Times New Roman"/>
+          <w:b/>
+          <w:bCs/>
+        </w:rPr>
+        <w:t>SQL queries and database schemas</w:t>
+      </w:r>
+      <w:r>
+        <w:rPr>
+          <w:rFonts w:ascii="Times New Roman" w:hAnsi="Times New Roman" w:cs="Times New Roman"/>
+        </w:rPr>
+        <w:t xml:space="preserve"> to efficiently process scraped datasets.</w:t>
+      </w:r>
+    </w:p>
+    <w:p>
+      <w:pPr>
+        <w:numPr>
+          <w:ilvl w:val="0"/>
+          <w:numId w:val="50"/>
+        </w:numPr>
+        <w:spacing w:line="276" w:lineRule="auto"/>
+        <w:rPr>
+          <w:rFonts w:ascii="Times New Roman" w:hAnsi="Times New Roman" w:cs="Times New Roman"/>
+        </w:rPr>
+      </w:pPr>
+      <w:r>
+        <w:rPr>
+          <w:rFonts w:ascii="Times New Roman" w:hAnsi="Times New Roman" w:cs="Times New Roman"/>
+        </w:rPr>
+        <w:t xml:space="preserve">Integrate scraped data into internal systems through </w:t>
+      </w:r>
+      <w:r>
+        <w:rPr>
+          <w:rFonts w:ascii="Times New Roman" w:hAnsi="Times New Roman" w:cs="Times New Roman"/>
+          <w:b/>
+          <w:bCs/>
+        </w:rPr>
+        <w:t>REST APIs and backend workflows</w:t>
+      </w:r>
+      <w:r>
+        <w:rPr>
+          <w:rFonts w:ascii="Times New Roman" w:hAnsi="Times New Roman" w:cs="Times New Roman"/>
+        </w:rPr>
+        <w:t>.</w:t>
+      </w:r>
+    </w:p>
+    <w:p>
+      <w:pPr>
+        <w:numPr>
+          <w:ilvl w:val="0"/>
+          <w:numId w:val="50"/>
+        </w:numPr>
+        <w:spacing w:line="276" w:lineRule="auto"/>
+        <w:rPr>
+          <w:rFonts w:ascii="Times New Roman" w:hAnsi="Times New Roman" w:cs="Times New Roman"/>
+        </w:rPr>
+      </w:pPr>
+      <w:r>
+        <w:rPr>
+          <w:rFonts w:ascii="Times New Roman" w:hAnsi="Times New Roman" w:cs="Times New Roman"/>
+        </w:rPr>
+        <w:t xml:space="preserve">Collaborate with team members in an </w:t>
+      </w:r>
+      <w:r>
+        <w:rPr>
+          <w:rFonts w:ascii="Times New Roman" w:hAnsi="Times New Roman" w:cs="Times New Roman"/>
+          <w:b/>
+          <w:bCs/>
+        </w:rPr>
+        <w:t>Agile/Scrum environment</w:t>
+      </w:r>
+      <w:r>
+        <w:rPr>
+          <w:rFonts w:ascii="Times New Roman" w:hAnsi="Times New Roman" w:cs="Times New Roman"/>
+        </w:rPr>
+        <w:t>, contributing to code reviews, debugging, and sprint deliverables.</w:t>
+      </w:r>
+    </w:p>
+    <w:p>
+      <w:pPr>
+        <w:numPr>
+          <w:ilvl w:val="0"/>
+          <w:numId w:val="50"/>
+        </w:numPr>
+        <w:spacing w:line="276" w:lineRule="auto"/>
+        <w:rPr>
+          <w:rFonts w:ascii="Times New Roman" w:hAnsi="Times New Roman" w:cs="Times New Roman"/>
+        </w:rPr>
+      </w:pPr>
+      <w:r>
+        <w:rPr>
+          <w:rFonts w:ascii="Times New Roman" w:hAnsi="Times New Roman" w:cs="Times New Roman"/>
+        </w:rPr>
+        <w:t xml:space="preserve">Ensure scraping tools and services meet standards of </w:t>
+      </w:r>
+      <w:r>
+        <w:rPr>
+          <w:rFonts w:ascii="Times New Roman" w:hAnsi="Times New Roman" w:cs="Times New Roman"/>
+          <w:b/>
+          <w:bCs/>
+        </w:rPr>
+        <w:t>performance, scalability, and reliability</w:t>
+      </w:r>
+      <w:r>
+        <w:rPr>
+          <w:rFonts w:ascii="Times New Roman" w:hAnsi="Times New Roman" w:cs="Times New Roman"/>
+        </w:rPr>
+        <w:t>.</w:t>
+      </w:r>
+    </w:p>
+    <w:p>
+      <w:pPr>
+        <w:spacing w:line="276" w:lineRule="auto"/>
+        <w:ind w:left="360"/>
+        <w:rPr>
+          <w:rFonts w:ascii="Times New Roman" w:hAnsi="Times New Roman" w:cs="Times New Roman"/>
+        </w:rPr>
+      </w:pPr>
+    </w:p>
+    <w:p>
+      <w:pPr>
+        <w:spacing w:line="276" w:lineRule="auto"/>
+        <w:rPr>
+          <w:rFonts w:ascii="Times New Roman" w:hAnsi="Times New Roman" w:cs="Times New Roman"/>
+        </w:rPr>
+      </w:pPr>
+      <w:r>
+        <w:rPr>
+          <w:rFonts w:ascii="Times New Roman" w:hAnsi="Times New Roman" w:cs="Times New Roman"/>
+          <w:b/>
+          <w:bCs/>
+        </w:rPr>
+        <w:t>Software Developer</w:t>
+      </w:r>
+    </w:p>
+    <w:p>
+      <w:pPr>
+        <w:spacing w:line="276" w:lineRule="auto"/>
+        <w:rPr>
+          <w:rFonts w:ascii="Times New Roman" w:hAnsi="Times New Roman" w:cs="Times New Roman"/>
+        </w:rPr>
+      </w:pPr>
+      <w:r>
+        <w:rPr>
+          <w:rFonts w:ascii="Times New Roman" w:hAnsi="Times New Roman" w:cs="Times New Roman"/>
+        </w:rPr>
+        <w:t>Telerad Medical Systems Ltd. |</w:t>
+      </w:r>
+      <w:r>
+        <w:rPr>
+          <w:rFonts w:ascii="Times New Roman" w:hAnsi="Times New Roman" w:cs="Times New Roman"/>
+        </w:rPr>
+        <w:t xml:space="preserve"> </w:t>
+      </w:r>
+      <w:r>
+        <w:rPr>
+          <w:rFonts w:ascii="Times New Roman" w:hAnsi="Times New Roman" w:cs="Times New Roman"/>
+          <w:b/>
+          <w:bCs/>
+        </w:rPr>
+        <w:t>01</w:t>
+      </w:r>
+      <w:r>
+        <w:rPr>
+          <w:rFonts w:ascii="Times New Roman" w:hAnsi="Times New Roman" w:cs="Times New Roman"/>
+        </w:rPr>
+        <w:t xml:space="preserve"> </w:t>
+      </w:r>
+      <w:r>
+        <w:rPr>
+          <w:rFonts w:ascii="Times New Roman" w:hAnsi="Times New Roman" w:cs="Times New Roman"/>
+          <w:b/>
+          <w:bCs/>
+        </w:rPr>
+        <w:t xml:space="preserve">Feb </w:t>
+      </w:r>
+      <w:r>
+        <w:rPr>
+          <w:rFonts w:ascii="Times New Roman" w:hAnsi="Times New Roman" w:cs="Times New Roman"/>
+          <w:b/>
+          <w:bCs/>
+        </w:rPr>
+        <w:t xml:space="preserve">2025 </w:t>
+      </w:r>
+      <w:r>
+        <w:rPr>
+          <w:rFonts w:ascii="Times New Roman" w:hAnsi="Times New Roman" w:cs="Times New Roman"/>
+          <w:b/>
+          <w:bCs/>
+        </w:rPr>
+        <w:t>–</w:t>
+      </w:r>
+      <w:r>
+        <w:rPr>
+          <w:rFonts w:ascii="Times New Roman" w:hAnsi="Times New Roman" w:cs="Times New Roman"/>
+          <w:b/>
+          <w:bCs/>
+        </w:rPr>
+        <w:t xml:space="preserve"> </w:t>
+      </w:r>
+      <w:r>
+        <w:rPr>
+          <w:rFonts w:ascii="Times New Roman" w:hAnsi="Times New Roman" w:cs="Times New Roman"/>
+          <w:b/>
+          <w:bCs/>
+        </w:rPr>
+        <w:t>07 September 2025</w:t>
+      </w:r>
+    </w:p>
+    <w:p>
+      <w:pPr>
+        <w:rPr>
+          <w:rFonts w:ascii="Times New Roman" w:hAnsi="Times New Roman" w:cs="Times New Roman"/>
+        </w:rPr>
+      </w:pPr>
+    </w:p>
+    <w:p>
+      <w:pPr>
+        <w:spacing w:line="276" w:lineRule="auto"/>
         <w:rPr>
           <w:rFonts w:ascii="Times New Roman" w:hAnsi="Times New Roman" w:cs="Times New Roman"/>
           <w:b/>
@@ -647,46 +1035,28 @@
           <w:ilvl w:val="0"/>
           <w:numId w:val="30"/>
         </w:numPr>
-        <w:spacing w:line="360" w:lineRule="auto"/>
-        <w:rPr>
-          <w:rFonts w:ascii="Times New Roman" w:hAnsi="Times New Roman" w:cs="Times New Roman"/>
-        </w:rPr>
-      </w:pPr>
-      <w:r>
-        <w:rPr>
-          <w:rFonts w:ascii="Times New Roman" w:hAnsi="Times New Roman" w:cs="Times New Roman"/>
-        </w:rPr>
-        <w:t xml:space="preserve">Building RESTful APIs with </w:t>
-      </w:r>
-      <w:r>
-        <w:rPr>
-          <w:rFonts w:ascii="Times New Roman" w:hAnsi="Times New Roman" w:cs="Times New Roman"/>
-        </w:rPr>
-        <w:t>Java</w:t>
-      </w:r>
-      <w:r>
-        <w:rPr>
-          <w:rFonts w:ascii="Times New Roman" w:hAnsi="Times New Roman" w:cs="Times New Roman"/>
-        </w:rPr>
-        <w:t xml:space="preserve"> and </w:t>
-      </w:r>
-      <w:r>
-        <w:rPr>
-          <w:rFonts w:ascii="Times New Roman" w:hAnsi="Times New Roman" w:cs="Times New Roman"/>
-        </w:rPr>
-        <w:t>Spring Boot</w:t>
-      </w:r>
-      <w:r>
-        <w:rPr>
-          <w:rFonts w:ascii="Times New Roman" w:hAnsi="Times New Roman" w:cs="Times New Roman"/>
-        </w:rPr>
-        <w:t>,</w:t>
-      </w:r>
-      <w:r>
-        <w:rPr>
-          <w:rFonts w:ascii="Times New Roman" w:hAnsi="Times New Roman" w:cs="Times New Roman"/>
-        </w:rPr>
-        <w:t xml:space="preserve"> </w:t>
+        <w:spacing w:line="276" w:lineRule="auto"/>
+        <w:rPr>
+          <w:rFonts w:ascii="Times New Roman" w:hAnsi="Times New Roman" w:cs="Times New Roman"/>
+        </w:rPr>
+      </w:pPr>
+      <w:r>
+        <w:rPr>
+          <w:rFonts w:ascii="Times New Roman" w:hAnsi="Times New Roman" w:cs="Times New Roman"/>
+        </w:rPr>
+        <w:t>E</w:t>
+      </w:r>
+      <w:r>
+        <w:rPr>
+          <w:rFonts w:ascii="Times New Roman" w:hAnsi="Times New Roman" w:cs="Times New Roman"/>
+        </w:rPr>
+        <w:t>ngaged in the development and maintenance of HMS, ERP, and HIS software systems</w:t>
+      </w:r>
+      <w:r>
+        <w:rPr>
+          <w:rFonts w:ascii="Times New Roman" w:hAnsi="Times New Roman" w:cs="Times New Roman"/>
+        </w:rPr>
+        <w:t>.</w:t>
       </w:r>
     </w:p>
     <w:p>
@@ -695,58 +1065,48 @@
           <w:ilvl w:val="0"/>
           <w:numId w:val="30"/>
         </w:numPr>
-        <w:spacing w:line="360" w:lineRule="auto"/>
-        <w:rPr>
-          <w:rFonts w:ascii="Times New Roman" w:hAnsi="Times New Roman" w:cs="Times New Roman"/>
-        </w:rPr>
-      </w:pPr>
-      <w:r>
-        <w:rPr>
-          <w:rFonts w:ascii="Times New Roman" w:hAnsi="Times New Roman" w:cs="Times New Roman"/>
-        </w:rPr>
-        <w:t xml:space="preserve">Frontend development using </w:t>
-      </w:r>
-      <w:r>
-        <w:rPr>
-          <w:rFonts w:ascii="Times New Roman" w:hAnsi="Times New Roman" w:cs="Times New Roman"/>
-        </w:rPr>
-        <w:t>React</w:t>
+        <w:spacing w:line="276" w:lineRule="auto"/>
+        <w:rPr>
+          <w:rFonts w:ascii="Times New Roman" w:hAnsi="Times New Roman" w:cs="Times New Roman"/>
+        </w:rPr>
+      </w:pPr>
+      <w:r>
+        <w:rPr>
+          <w:rFonts w:ascii="Times New Roman" w:hAnsi="Times New Roman" w:cs="Times New Roman"/>
+        </w:rPr>
+        <w:t xml:space="preserve">Built </w:t>
+      </w:r>
+      <w:r>
+        <w:rPr>
+          <w:rFonts w:ascii="Times New Roman" w:hAnsi="Times New Roman" w:cs="Times New Roman"/>
+        </w:rPr>
+        <w:t xml:space="preserve">RESTful APIs with </w:t>
+      </w:r>
+      <w:r>
+        <w:rPr>
+          <w:rFonts w:ascii="Times New Roman" w:hAnsi="Times New Roman" w:cs="Times New Roman"/>
+        </w:rPr>
+        <w:t>Java</w:t>
+      </w:r>
+      <w:r>
+        <w:rPr>
+          <w:rFonts w:ascii="Times New Roman" w:hAnsi="Times New Roman" w:cs="Times New Roman"/>
+        </w:rPr>
+        <w:t xml:space="preserve"> and </w:t>
+      </w:r>
+      <w:r>
+        <w:rPr>
+          <w:rFonts w:ascii="Times New Roman" w:hAnsi="Times New Roman" w:cs="Times New Roman"/>
+          <w:b/>
+          <w:bCs/>
+        </w:rPr>
+        <w:t>Spring Boot</w:t>
       </w:r>
       <w:r>
         <w:rPr>
           <w:rFonts w:ascii="Times New Roman" w:hAnsi="Times New Roman" w:cs="Times New Roman"/>
         </w:rPr>
         <w:t>,</w:t>
-      </w:r>
-      <w:r>
-        <w:rPr>
-          <w:rFonts w:ascii="Times New Roman" w:hAnsi="Times New Roman" w:cs="Times New Roman"/>
-        </w:rPr>
-        <w:t xml:space="preserve"> Angular,</w:t>
-      </w:r>
-      <w:r>
-        <w:rPr>
-          <w:rFonts w:ascii="Times New Roman" w:hAnsi="Times New Roman" w:cs="Times New Roman"/>
-        </w:rPr>
-        <w:t xml:space="preserve"> JavaScript, HTML</w:t>
-      </w:r>
-      <w:r>
-        <w:rPr>
-          <w:rFonts w:ascii="Times New Roman" w:hAnsi="Times New Roman" w:cs="Times New Roman"/>
-        </w:rPr>
-        <w:t xml:space="preserve">, and </w:t>
-      </w:r>
-      <w:r>
-        <w:rPr>
-          <w:rFonts w:ascii="Times New Roman" w:hAnsi="Times New Roman" w:cs="Times New Roman"/>
-        </w:rPr>
-        <w:t>CSS</w:t>
-      </w:r>
-      <w:r>
-        <w:rPr>
-          <w:rFonts w:ascii="Times New Roman" w:hAnsi="Times New Roman" w:cs="Times New Roman"/>
-        </w:rPr>
-        <w:t>.</w:t>
       </w:r>
       <w:r>
         <w:rPr>
@@ -761,82 +1121,30 @@
           <w:ilvl w:val="0"/>
           <w:numId w:val="30"/>
         </w:numPr>
-        <w:spacing w:line="360" w:lineRule="auto"/>
-        <w:rPr>
-          <w:rFonts w:ascii="Times New Roman" w:hAnsi="Times New Roman" w:cs="Times New Roman"/>
-        </w:rPr>
-      </w:pPr>
-      <w:r>
-        <w:rPr>
-          <w:rFonts w:ascii="Times New Roman" w:hAnsi="Times New Roman" w:cs="Times New Roman"/>
-        </w:rPr>
-        <w:t xml:space="preserve">Writing and optimizing </w:t>
-      </w:r>
-      <w:r>
-        <w:rPr>
-          <w:rFonts w:ascii="Times New Roman" w:hAnsi="Times New Roman" w:cs="Times New Roman"/>
-        </w:rPr>
-        <w:t>SQL</w:t>
-      </w:r>
-      <w:r>
-        <w:rPr>
-          <w:rFonts w:ascii="Times New Roman" w:hAnsi="Times New Roman" w:cs="Times New Roman"/>
-        </w:rPr>
-        <w:t xml:space="preserve"> and </w:t>
-      </w:r>
-      <w:r>
-        <w:rPr>
-          <w:rFonts w:ascii="Times New Roman" w:hAnsi="Times New Roman" w:cs="Times New Roman"/>
-        </w:rPr>
-        <w:t>PL/SQL</w:t>
-      </w:r>
-      <w:r>
-        <w:rPr>
-          <w:rFonts w:ascii="Times New Roman" w:hAnsi="Times New Roman" w:cs="Times New Roman"/>
-        </w:rPr>
-        <w:t xml:space="preserve"> queries</w:t>
-      </w:r>
-      <w:r>
-        <w:rPr>
-          <w:rFonts w:ascii="Times New Roman" w:hAnsi="Times New Roman" w:cs="Times New Roman"/>
-        </w:rPr>
-        <w:t xml:space="preserve"> for </w:t>
-      </w:r>
-      <w:r>
-        <w:rPr>
-          <w:rFonts w:ascii="Times New Roman" w:hAnsi="Times New Roman" w:cs="Times New Roman"/>
-        </w:rPr>
-        <w:t>Oracle Apex</w:t>
-      </w:r>
-      <w:r>
-        <w:rPr>
-          <w:rFonts w:ascii="Times New Roman" w:hAnsi="Times New Roman" w:cs="Times New Roman"/>
-        </w:rPr>
-        <w:t xml:space="preserve"> Software</w:t>
-      </w:r>
-      <w:r>
-        <w:rPr>
-          <w:rFonts w:ascii="Times New Roman" w:hAnsi="Times New Roman" w:cs="Times New Roman"/>
-        </w:rPr>
-        <w:t>,</w:t>
-      </w:r>
-      <w:r>
-        <w:rPr>
-          <w:rFonts w:ascii="Times New Roman" w:hAnsi="Times New Roman" w:cs="Times New Roman"/>
-        </w:rPr>
-        <w:t xml:space="preserve"> </w:t>
-      </w:r>
-      <w:r>
-        <w:rPr>
-          <w:rFonts w:ascii="Times New Roman" w:hAnsi="Times New Roman" w:cs="Times New Roman"/>
-        </w:rPr>
-        <w:t>contributing</w:t>
-      </w:r>
-      <w:r>
-        <w:rPr>
-          <w:rFonts w:ascii="Times New Roman" w:hAnsi="Times New Roman" w:cs="Times New Roman"/>
-        </w:rPr>
-        <w:t xml:space="preserve"> to system design, implementation, and debugging</w:t>
+        <w:spacing w:line="276" w:lineRule="auto"/>
+        <w:rPr>
+          <w:rFonts w:ascii="Times New Roman" w:hAnsi="Times New Roman" w:cs="Times New Roman"/>
+        </w:rPr>
+      </w:pPr>
+      <w:r>
+        <w:rPr>
+          <w:rFonts w:ascii="Times New Roman" w:hAnsi="Times New Roman" w:cs="Times New Roman"/>
+        </w:rPr>
+        <w:t>En</w:t>
+      </w:r>
+      <w:r>
+        <w:rPr>
+          <w:rFonts w:ascii="Times New Roman" w:hAnsi="Times New Roman" w:cs="Times New Roman"/>
+        </w:rPr>
+        <w:t xml:space="preserve">veloped frontends using </w:t>
+      </w:r>
+      <w:r>
+        <w:rPr>
+          <w:rFonts w:ascii="Times New Roman" w:hAnsi="Times New Roman" w:cs="Times New Roman"/>
+          <w:b/>
+          <w:bCs/>
+        </w:rPr>
+        <w:t>React, JavaScript, HTML, and CSS</w:t>
       </w:r>
       <w:r>
         <w:rPr>
@@ -851,78 +1159,62 @@
           <w:ilvl w:val="0"/>
           <w:numId w:val="30"/>
         </w:numPr>
-        <w:spacing w:line="360" w:lineRule="auto"/>
-        <w:rPr>
-          <w:rFonts w:ascii="Times New Roman" w:hAnsi="Times New Roman" w:cs="Times New Roman"/>
-        </w:rPr>
-      </w:pPr>
-      <w:r>
-        <w:rPr>
-          <w:rFonts w:ascii="Times New Roman" w:hAnsi="Times New Roman" w:cs="Times New Roman"/>
-        </w:rPr>
-        <w:t>D</w:t>
-      </w:r>
-      <w:r>
-        <w:rPr>
-          <w:rFonts w:ascii="Times New Roman" w:hAnsi="Times New Roman" w:cs="Times New Roman"/>
-        </w:rPr>
-        <w:t>eveloping</w:t>
-      </w:r>
-      <w:r>
-        <w:rPr>
-          <w:rFonts w:ascii="Times New Roman" w:hAnsi="Times New Roman" w:cs="Times New Roman"/>
-        </w:rPr>
-        <w:t xml:space="preserve"> </w:t>
-      </w:r>
-      <w:r>
-        <w:rPr>
-          <w:rFonts w:ascii="Times New Roman" w:hAnsi="Times New Roman" w:cs="Times New Roman"/>
-        </w:rPr>
-        <w:t xml:space="preserve">a </w:t>
-      </w:r>
-      <w:r>
-        <w:rPr>
-          <w:rFonts w:ascii="Times New Roman" w:hAnsi="Times New Roman" w:cs="Times New Roman"/>
-        </w:rPr>
-        <w:t xml:space="preserve">PACS </w:t>
-      </w:r>
-      <w:r>
-        <w:rPr>
-          <w:rFonts w:ascii="Times New Roman" w:hAnsi="Times New Roman" w:cs="Times New Roman"/>
-        </w:rPr>
-        <w:t>(DICOM Viewer) Software</w:t>
-      </w:r>
-      <w:r>
-        <w:rPr>
-          <w:rFonts w:ascii="Times New Roman" w:hAnsi="Times New Roman" w:cs="Times New Roman"/>
-        </w:rPr>
-        <w:t xml:space="preserve"> using </w:t>
-      </w:r>
-      <w:r>
-        <w:rPr>
-          <w:rFonts w:ascii="Times New Roman" w:hAnsi="Times New Roman" w:cs="Times New Roman"/>
-        </w:rPr>
-        <w:t>Spring Boot</w:t>
-      </w:r>
-      <w:r>
-        <w:rPr>
-          <w:rFonts w:ascii="Times New Roman" w:hAnsi="Times New Roman" w:cs="Times New Roman"/>
-        </w:rPr>
-        <w:t xml:space="preserve"> and </w:t>
-      </w:r>
-      <w:bookmarkStart w:id="2" w:name="_Hlk201603849"/>
-      <w:r>
-        <w:rPr>
-          <w:rFonts w:ascii="Times New Roman" w:hAnsi="Times New Roman" w:cs="Times New Roman"/>
-        </w:rPr>
-        <w:t>React</w:t>
-      </w:r>
-      <w:bookmarkEnd w:id="2"/>
-      <w:r>
-        <w:rPr>
-          <w:rFonts w:ascii="Times New Roman" w:hAnsi="Times New Roman" w:cs="Times New Roman"/>
-        </w:rPr>
-        <w:t>.</w:t>
+        <w:spacing w:line="276" w:lineRule="auto"/>
+        <w:rPr>
+          <w:rFonts w:ascii="Times New Roman" w:hAnsi="Times New Roman" w:cs="Times New Roman"/>
+        </w:rPr>
+      </w:pPr>
+      <w:r>
+        <w:rPr>
+          <w:rFonts w:ascii="Times New Roman" w:hAnsi="Times New Roman" w:cs="Times New Roman"/>
+        </w:rPr>
+        <w:t xml:space="preserve">Wrote and optimized </w:t>
+      </w:r>
+      <w:r>
+        <w:rPr>
+          <w:rFonts w:ascii="Times New Roman" w:hAnsi="Times New Roman" w:cs="Times New Roman"/>
+          <w:b/>
+          <w:bCs/>
+        </w:rPr>
+        <w:t>SQL/PLSQL queries</w:t>
+      </w:r>
+      <w:r>
+        <w:rPr>
+          <w:rFonts w:ascii="Times New Roman" w:hAnsi="Times New Roman" w:cs="Times New Roman"/>
+        </w:rPr>
+        <w:t xml:space="preserve"> in Oracle Apex for system design and debugging.</w:t>
+      </w:r>
+    </w:p>
+    <w:p>
+      <w:pPr>
+        <w:numPr>
+          <w:ilvl w:val="0"/>
+          <w:numId w:val="30"/>
+        </w:numPr>
+        <w:spacing w:line="276" w:lineRule="auto"/>
+        <w:rPr>
+          <w:rFonts w:ascii="Times New Roman" w:hAnsi="Times New Roman" w:cs="Times New Roman"/>
+        </w:rPr>
+      </w:pPr>
+      <w:r>
+        <w:rPr>
+          <w:rFonts w:ascii="Times New Roman" w:hAnsi="Times New Roman" w:cs="Times New Roman"/>
+        </w:rPr>
+        <w:t xml:space="preserve">Contributed to development of a </w:t>
+      </w:r>
+      <w:r>
+        <w:rPr>
+          <w:rFonts w:ascii="Times New Roman" w:hAnsi="Times New Roman" w:cs="Times New Roman"/>
+          <w:b/>
+          <w:bCs/>
+        </w:rPr>
+        <w:t>PACS (DICOM Viewer) software</w:t>
+      </w:r>
+      <w:r>
+        <w:rPr>
+          <w:rFonts w:ascii="Times New Roman" w:hAnsi="Times New Roman" w:cs="Times New Roman"/>
+        </w:rPr>
+        <w:t xml:space="preserve"> using Spring Boot and React.</w:t>
       </w:r>
     </w:p>
     <w:p>
@@ -931,6 +1223,7 @@
         <w:pBdr>
           <w:bottom w:val="single" w:sz="4" w:space="1" w:color="auto"/>
         </w:pBdr>
+        <w:spacing w:line="276" w:lineRule="auto"/>
         <w:ind w:left="0" w:firstLine="0"/>
         <w:rPr>
           <w:rFonts w:ascii="Times New Roman" w:hAnsi="Times New Roman" w:cs="Times New Roman"/>
@@ -948,6 +1241,7 @@
         <w:pBdr>
           <w:bottom w:val="single" w:sz="4" w:space="1" w:color="auto"/>
         </w:pBdr>
+        <w:spacing w:line="276" w:lineRule="auto"/>
         <w:ind w:left="0" w:firstLine="0"/>
         <w:rPr>
           <w:rFonts w:ascii="Times New Roman" w:hAnsi="Times New Roman" w:cs="Times New Roman"/>
@@ -972,6 +1266,7 @@
     <w:p>
       <w:pPr>
         <w:pStyle w:val="BodyText"/>
+        <w:spacing w:line="276" w:lineRule="auto"/>
         <w:ind w:left="0" w:firstLine="0"/>
         <w:rPr>
           <w:rFonts w:ascii="Times New Roman" w:hAnsi="Times New Roman" w:cs="Times New Roman"/>
@@ -1041,7 +1336,7 @@
           <w:sz w:val="22"/>
           <w:szCs w:val="22"/>
         </w:rPr>
-        <w:t xml:space="preserve">Java, </w:t>
+        <w:t>Java</w:t>
       </w:r>
       <w:r>
         <w:rPr>
@@ -1049,7 +1344,7 @@
           <w:sz w:val="22"/>
           <w:szCs w:val="22"/>
         </w:rPr>
-        <w:t xml:space="preserve">Spring, </w:t>
+        <w:t xml:space="preserve">, </w:t>
       </w:r>
       <w:r>
         <w:rPr>
@@ -1058,6 +1353,30 @@
           <w:szCs w:val="22"/>
         </w:rPr>
         <w:t>Spring Boot, Angular, React, Flutter, JavaScript, HTML, CSS</w:t>
+      </w:r>
+      <w:r>
+        <w:rPr>
+          <w:rFonts w:ascii="Times New Roman" w:hAnsi="Times New Roman" w:cs="Times New Roman"/>
+          <w:sz w:val="22"/>
+          <w:szCs w:val="22"/>
+        </w:rPr>
+        <w:t>,</w:t>
+      </w:r>
+      <w:r>
+        <w:rPr>
+          <w:rFonts w:ascii="Times New Roman" w:hAnsi="Times New Roman" w:cs="Times New Roman"/>
+          <w:sz w:val="22"/>
+          <w:szCs w:val="22"/>
+        </w:rPr>
+        <w:t xml:space="preserve"> </w:t>
+      </w:r>
+      <w:r>
+        <w:rPr>
+          <w:rFonts w:ascii="Times New Roman" w:hAnsi="Times New Roman" w:cs="Times New Roman"/>
+          <w:sz w:val="22"/>
+          <w:szCs w:val="22"/>
+        </w:rPr>
+        <w:t>Oracle Apex</w:t>
       </w:r>
     </w:p>
     <w:p>
@@ -1139,14 +1458,6 @@
         </w:rPr>
         <w:t>, PL/SQL</w:t>
       </w:r>
-      <w:r>
-        <w:rPr>
-          <w:rFonts w:ascii="Times New Roman" w:hAnsi="Times New Roman" w:cs="Times New Roman"/>
-          <w:sz w:val="22"/>
-          <w:szCs w:val="22"/>
-        </w:rPr>
-        <w:t>,</w:t>
-      </w:r>
     </w:p>
     <w:p>
       <w:pPr>
@@ -1305,6 +1616,7 @@
     <w:p>
       <w:pPr>
         <w:pStyle w:val="BodyText"/>
+        <w:spacing w:line="276" w:lineRule="auto"/>
         <w:ind w:left="0" w:firstLine="0"/>
         <w:rPr>
           <w:rFonts w:ascii="Times New Roman" w:hAnsi="Times New Roman" w:cs="Times New Roman"/>
@@ -1317,6 +1629,7 @@
         <w:pBdr>
           <w:bottom w:val="single" w:sz="4" w:space="1" w:color="auto"/>
         </w:pBdr>
+        <w:spacing w:line="276" w:lineRule="auto"/>
         <w:ind w:left="0" w:firstLine="0"/>
         <w:rPr>
           <w:rFonts w:ascii="Times New Roman" w:hAnsi="Times New Roman" w:cs="Times New Roman"/>
@@ -1342,6 +1655,7 @@
         <w:tabs>
           <w:tab w:val="right" w:pos="12240"/>
         </w:tabs>
+        <w:spacing w:line="276" w:lineRule="auto"/>
         <w:rPr>
           <w:rFonts w:ascii="Times New Roman" w:hAnsi="Times New Roman" w:cs="Times New Roman"/>
           <w:b/>
@@ -1405,7 +1719,7 @@
         <w:tabs>
           <w:tab w:val="right" w:pos="12240"/>
         </w:tabs>
-        <w:spacing w:before="160" w:line="360" w:lineRule="auto"/>
+        <w:spacing w:before="160" w:line="276" w:lineRule="auto"/>
         <w:rPr>
           <w:rFonts w:ascii="Times New Roman" w:hAnsi="Times New Roman" w:cs="Times New Roman"/>
           <w:b/>
@@ -1418,7 +1732,21 @@
           <w:rFonts w:ascii="Times New Roman" w:hAnsi="Times New Roman" w:cs="Times New Roman"/>
           <w:iCs/>
         </w:rPr>
-        <w:t>Completed 1-year training on enterprise web &amp; mobile app development with Spring Boot, Angular, Flutter, Oracle 19c, and Hibernate under the</w:t>
+        <w:t>Completed 1-year training on enterprise web &amp; mobile app development with Spring Boot, Angular, Flutter, Oracle 19c,</w:t>
+      </w:r>
+      <w:r>
+        <w:rPr>
+          <w:rFonts w:ascii="Times New Roman" w:hAnsi="Times New Roman" w:cs="Times New Roman"/>
+          <w:iCs/>
+        </w:rPr>
+        <w:t xml:space="preserve"> etc.</w:t>
+      </w:r>
+      <w:r>
+        <w:rPr>
+          <w:rFonts w:ascii="Times New Roman" w:hAnsi="Times New Roman" w:cs="Times New Roman"/>
+          <w:iCs/>
+        </w:rPr>
+        <w:t xml:space="preserve"> under the</w:t>
       </w:r>
       <w:r>
         <w:rPr>
@@ -1429,7 +1757,6 @@
         </w:rPr>
         <w:t xml:space="preserve"> </w:t>
       </w:r>
-      <w:proofErr w:type="spellStart"/>
       <w:r>
         <w:rPr>
           <w:rFonts w:ascii="Times New Roman" w:hAnsi="Times New Roman" w:cs="Times New Roman"/>
@@ -1437,9 +1764,8 @@
           <w:bCs/>
           <w:iCs/>
         </w:rPr>
-        <w:t>IsDB</w:t>
-      </w:r>
-      <w:proofErr w:type="spellEnd"/>
+        <w:t>Islamic Development Bank-Bangladesh Islamic Solidarity Educational Wakf</w:t>
+      </w:r>
       <w:r>
         <w:rPr>
           <w:rFonts w:ascii="Times New Roman" w:hAnsi="Times New Roman" w:cs="Times New Roman"/>
@@ -1447,7 +1773,7 @@
           <w:bCs/>
           <w:iCs/>
         </w:rPr>
-        <w:t xml:space="preserve">-BISEW IT Scholarship </w:t>
+        <w:t xml:space="preserve"> (</w:t>
       </w:r>
       <w:proofErr w:type="spellStart"/>
       <w:r>
@@ -1457,7 +1783,7 @@
           <w:bCs/>
           <w:iCs/>
         </w:rPr>
-        <w:t>Programme</w:t>
+        <w:t>IsDB</w:t>
       </w:r>
       <w:proofErr w:type="spellEnd"/>
       <w:r>
@@ -1467,22 +1793,8 @@
           <w:bCs/>
           <w:iCs/>
         </w:rPr>
-        <w:t xml:space="preserve"> </w:t>
-      </w:r>
-      <w:r>
-        <w:rPr>
-          <w:rFonts w:ascii="Times New Roman" w:hAnsi="Times New Roman" w:cs="Times New Roman"/>
-          <w:iCs/>
-        </w:rPr>
-        <w:t>(IDB)</w:t>
-      </w:r>
-    </w:p>
-    <w:p>
-      <w:pPr>
-        <w:rPr>
-          <w:rFonts w:ascii="Times New Roman" w:hAnsi="Times New Roman" w:cs="Times New Roman"/>
-        </w:rPr>
-      </w:pPr>
+        <w:t>-BISEW)</w:t>
+      </w:r>
     </w:p>
     <w:p>
       <w:pPr>
@@ -1490,6 +1802,7 @@
         <w:pBdr>
           <w:bottom w:val="single" w:sz="4" w:space="1" w:color="auto"/>
         </w:pBdr>
+        <w:spacing w:line="276" w:lineRule="auto"/>
         <w:ind w:left="0" w:firstLine="0"/>
         <w:rPr>
           <w:rFonts w:ascii="Times New Roman" w:hAnsi="Times New Roman" w:cs="Times New Roman"/>
@@ -1507,6 +1820,7 @@
           <w:sz w:val="24"/>
           <w:szCs w:val="24"/>
         </w:rPr>
+        <w:lastRenderedPageBreak/>
         <w:t>PROJECTS EXPERIENCE</w:t>
       </w:r>
     </w:p>
@@ -1515,6 +1829,7 @@
         <w:tabs>
           <w:tab w:val="right" w:pos="12240"/>
         </w:tabs>
+        <w:spacing w:line="276" w:lineRule="auto"/>
         <w:rPr>
           <w:rFonts w:ascii="Times New Roman" w:hAnsi="Times New Roman" w:cs="Times New Roman"/>
           <w:b/>
@@ -1534,7 +1849,7 @@
           <w:ilvl w:val="0"/>
           <w:numId w:val="45"/>
         </w:numPr>
-        <w:spacing w:line="360" w:lineRule="auto"/>
+        <w:spacing w:line="276" w:lineRule="auto"/>
         <w:rPr>
           <w:rFonts w:ascii="Times New Roman" w:hAnsi="Times New Roman" w:cs="Times New Roman"/>
           <w:b w:val="0"/>
@@ -1622,7 +1937,7 @@
         </w:rPr>
         <w:t xml:space="preserve"> </w:t>
       </w:r>
-      <w:hyperlink r:id="rId16" w:history="1">
+      <w:hyperlink r:id="rId19" w:history="1">
         <w:r>
           <w:rPr>
             <w:rStyle w:val="Hyperlink"/>
@@ -1641,11 +1956,25 @@
     <w:p>
       <w:pPr>
         <w:pStyle w:val="Heading1"/>
+        <w:spacing w:line="276" w:lineRule="auto"/>
+        <w:ind w:left="720"/>
+        <w:rPr>
+          <w:rFonts w:ascii="Times New Roman" w:hAnsi="Times New Roman" w:cs="Times New Roman"/>
+          <w:b w:val="0"/>
+          <w:bCs w:val="0"/>
+          <w:sz w:val="22"/>
+          <w:szCs w:val="22"/>
+        </w:rPr>
+      </w:pPr>
+    </w:p>
+    <w:p>
+      <w:pPr>
+        <w:pStyle w:val="Heading1"/>
         <w:numPr>
           <w:ilvl w:val="0"/>
           <w:numId w:val="46"/>
         </w:numPr>
-        <w:spacing w:line="360" w:lineRule="auto"/>
+        <w:spacing w:line="276" w:lineRule="auto"/>
         <w:rPr>
           <w:rFonts w:ascii="Times New Roman" w:hAnsi="Times New Roman" w:cs="Times New Roman"/>
           <w:b w:val="0"/>
@@ -1660,7 +1989,6 @@
           <w:sz w:val="22"/>
           <w:szCs w:val="22"/>
         </w:rPr>
-        <w:lastRenderedPageBreak/>
         <w:t xml:space="preserve">Professional </w:t>
       </w:r>
       <w:r>
@@ -1741,7 +2069,7 @@
         </w:rPr>
         <w:t xml:space="preserve"> </w:t>
       </w:r>
-      <w:hyperlink r:id="rId17" w:history="1">
+      <w:hyperlink r:id="rId20" w:history="1">
         <w:r>
           <w:rPr>
             <w:rStyle w:val="Hyperlink"/>
@@ -1759,6 +2087,7 @@
     </w:p>
     <w:p>
       <w:pPr>
+        <w:spacing w:line="276" w:lineRule="auto"/>
         <w:rPr>
           <w:rFonts w:ascii="Times New Roman" w:hAnsi="Times New Roman" w:cs="Times New Roman"/>
         </w:rPr>
@@ -1771,7 +2100,7 @@
           <w:ilvl w:val="0"/>
           <w:numId w:val="47"/>
         </w:numPr>
-        <w:spacing w:line="360" w:lineRule="auto"/>
+        <w:spacing w:line="276" w:lineRule="auto"/>
         <w:rPr>
           <w:rFonts w:ascii="Times New Roman" w:hAnsi="Times New Roman" w:cs="Times New Roman"/>
           <w:sz w:val="22"/>
@@ -1793,7 +2122,7 @@
         <w:tabs>
           <w:tab w:val="right" w:pos="12240"/>
         </w:tabs>
-        <w:spacing w:line="360" w:lineRule="auto"/>
+        <w:spacing w:line="276" w:lineRule="auto"/>
         <w:ind w:left="720" w:firstLine="0"/>
         <w:rPr>
           <w:rFonts w:ascii="Times New Roman" w:hAnsi="Times New Roman" w:cs="Times New Roman"/>
@@ -1812,7 +2141,7 @@
         <w:tabs>
           <w:tab w:val="right" w:pos="12240"/>
         </w:tabs>
-        <w:spacing w:line="360" w:lineRule="auto"/>
+        <w:spacing w:line="276" w:lineRule="auto"/>
         <w:ind w:left="720" w:firstLine="0"/>
         <w:rPr>
           <w:rFonts w:ascii="Times New Roman" w:hAnsi="Times New Roman" w:cs="Times New Roman"/>
@@ -1833,7 +2162,7 @@
         <w:tabs>
           <w:tab w:val="right" w:pos="12240"/>
         </w:tabs>
-        <w:spacing w:line="360" w:lineRule="auto"/>
+        <w:spacing w:line="276" w:lineRule="auto"/>
         <w:ind w:left="720" w:firstLine="0"/>
         <w:rPr>
           <w:rFonts w:ascii="Times New Roman" w:hAnsi="Times New Roman" w:cs="Times New Roman"/>
@@ -1852,7 +2181,7 @@
         <w:tabs>
           <w:tab w:val="right" w:pos="12240"/>
         </w:tabs>
-        <w:spacing w:line="360" w:lineRule="auto"/>
+        <w:spacing w:line="276" w:lineRule="auto"/>
         <w:ind w:left="720" w:firstLine="0"/>
         <w:rPr>
           <w:rFonts w:ascii="Times New Roman" w:hAnsi="Times New Roman" w:cs="Times New Roman"/>
@@ -1871,7 +2200,7 @@
         <w:tabs>
           <w:tab w:val="right" w:pos="12240"/>
         </w:tabs>
-        <w:spacing w:line="360" w:lineRule="auto"/>
+        <w:spacing w:line="276" w:lineRule="auto"/>
         <w:ind w:left="720" w:firstLine="0"/>
         <w:rPr>
           <w:rFonts w:ascii="Times New Roman" w:hAnsi="Times New Roman" w:cs="Times New Roman"/>
@@ -1890,7 +2219,7 @@
         <w:tabs>
           <w:tab w:val="right" w:pos="12240"/>
         </w:tabs>
-        <w:spacing w:line="360" w:lineRule="auto"/>
+        <w:spacing w:line="276" w:lineRule="auto"/>
         <w:ind w:left="720" w:firstLine="0"/>
         <w:rPr>
           <w:rStyle w:val="Hyperlink"/>
@@ -1920,7 +2249,7 @@
         </w:rPr>
         <w:t xml:space="preserve">  </w:t>
       </w:r>
-      <w:hyperlink r:id="rId18" w:history="1">
+      <w:hyperlink r:id="rId21" w:history="1">
         <w:r>
           <w:rPr>
             <w:rStyle w:val="Hyperlink"/>
@@ -1939,7 +2268,7 @@
         <w:tabs>
           <w:tab w:val="right" w:pos="12240"/>
         </w:tabs>
-        <w:spacing w:line="360" w:lineRule="auto"/>
+        <w:spacing w:line="276" w:lineRule="auto"/>
         <w:rPr>
           <w:rFonts w:ascii="Times New Roman" w:hAnsi="Times New Roman" w:cs="Times New Roman"/>
           <w:b/>
@@ -1954,7 +2283,7 @@
           <w:ilvl w:val="0"/>
           <w:numId w:val="48"/>
         </w:numPr>
-        <w:spacing w:line="360" w:lineRule="auto"/>
+        <w:spacing w:line="276" w:lineRule="auto"/>
         <w:rPr>
           <w:rFonts w:ascii="Times New Roman" w:hAnsi="Times New Roman" w:cs="Times New Roman"/>
           <w:sz w:val="22"/>
@@ -1976,7 +2305,7 @@
         <w:tabs>
           <w:tab w:val="right" w:pos="12240"/>
         </w:tabs>
-        <w:spacing w:line="360" w:lineRule="auto"/>
+        <w:spacing w:line="276" w:lineRule="auto"/>
         <w:ind w:left="720" w:firstLine="0"/>
         <w:rPr>
           <w:rFonts w:ascii="Times New Roman" w:hAnsi="Times New Roman" w:cs="Times New Roman"/>
@@ -1995,7 +2324,7 @@
         <w:tabs>
           <w:tab w:val="right" w:pos="12240"/>
         </w:tabs>
-        <w:spacing w:line="360" w:lineRule="auto"/>
+        <w:spacing w:line="276" w:lineRule="auto"/>
         <w:ind w:left="720" w:firstLine="0"/>
         <w:rPr>
           <w:rFonts w:ascii="Times New Roman" w:hAnsi="Times New Roman" w:cs="Times New Roman"/>
@@ -2034,7 +2363,7 @@
         <w:tabs>
           <w:tab w:val="right" w:pos="12240"/>
         </w:tabs>
-        <w:spacing w:line="360" w:lineRule="auto"/>
+        <w:spacing w:line="276" w:lineRule="auto"/>
         <w:ind w:left="720" w:firstLine="0"/>
         <w:rPr>
           <w:rFonts w:ascii="Times New Roman" w:hAnsi="Times New Roman" w:cs="Times New Roman"/>
@@ -2081,7 +2410,7 @@
         <w:tabs>
           <w:tab w:val="right" w:pos="12240"/>
         </w:tabs>
-        <w:spacing w:line="360" w:lineRule="auto"/>
+        <w:spacing w:line="276" w:lineRule="auto"/>
         <w:ind w:left="720" w:firstLine="0"/>
         <w:rPr>
           <w:rFonts w:ascii="Times New Roman" w:hAnsi="Times New Roman" w:cs="Times New Roman"/>
@@ -2114,7 +2443,7 @@
         <w:tabs>
           <w:tab w:val="right" w:pos="12240"/>
         </w:tabs>
-        <w:spacing w:line="360" w:lineRule="auto"/>
+        <w:spacing w:line="276" w:lineRule="auto"/>
         <w:ind w:left="720" w:firstLine="0"/>
       </w:pPr>
       <w:r>
@@ -2146,7 +2475,7 @@
         </w:rPr>
         <w:t xml:space="preserve"> </w:t>
       </w:r>
-      <w:hyperlink r:id="rId19" w:history="1">
+      <w:hyperlink r:id="rId22" w:history="1">
         <w:r>
           <w:rPr>
             <w:rStyle w:val="Hyperlink"/>
@@ -2165,7 +2494,7 @@
         <w:tabs>
           <w:tab w:val="right" w:pos="12240"/>
         </w:tabs>
-        <w:spacing w:line="360" w:lineRule="auto"/>
+        <w:spacing w:line="276" w:lineRule="auto"/>
         <w:rPr>
           <w:rFonts w:ascii="Times New Roman" w:hAnsi="Times New Roman" w:cs="Times New Roman"/>
         </w:rPr>
@@ -2177,6 +2506,7 @@
         <w:pBdr>
           <w:bottom w:val="single" w:sz="4" w:space="1" w:color="auto"/>
         </w:pBdr>
+        <w:spacing w:line="276" w:lineRule="auto"/>
         <w:ind w:left="0" w:firstLine="0"/>
         <w:rPr>
           <w:rFonts w:ascii="Times New Roman" w:hAnsi="Times New Roman" w:cs="Times New Roman"/>
@@ -2200,6 +2530,7 @@
     <w:p>
       <w:pPr>
         <w:pStyle w:val="BodyText"/>
+        <w:spacing w:line="276" w:lineRule="auto"/>
         <w:ind w:left="0" w:firstLine="0"/>
         <w:rPr>
           <w:rFonts w:ascii="Times New Roman" w:hAnsi="Times New Roman" w:cs="Times New Roman"/>
@@ -2613,6 +2944,7 @@
     <w:p>
       <w:pPr>
         <w:pStyle w:val="BodyText"/>
+        <w:spacing w:line="276" w:lineRule="auto"/>
         <w:ind w:hanging="128"/>
         <w:rPr>
           <w:rFonts w:ascii="Times New Roman" w:hAnsi="Times New Roman" w:cs="Times New Roman"/>
@@ -2627,6 +2959,7 @@
         <w:pBdr>
           <w:bottom w:val="single" w:sz="4" w:space="1" w:color="auto"/>
         </w:pBdr>
+        <w:spacing w:line="276" w:lineRule="auto"/>
         <w:ind w:left="0" w:firstLine="0"/>
         <w:rPr>
           <w:rFonts w:ascii="Times New Roman" w:hAnsi="Times New Roman" w:cs="Times New Roman"/>
@@ -2650,6 +2983,7 @@
     <w:p>
       <w:pPr>
         <w:pStyle w:val="BodyText"/>
+        <w:spacing w:line="276" w:lineRule="auto"/>
         <w:ind w:left="720" w:firstLine="0"/>
         <w:rPr>
           <w:rFonts w:ascii="Times New Roman" w:hAnsi="Times New Roman" w:cs="Times New Roman"/>
@@ -2895,7 +3229,7 @@
                               </w:rPr>
                               <w:t xml:space="preserve">Email: </w:t>
                             </w:r>
-                            <w:hyperlink r:id="rId20" w:history="1">
+                            <w:hyperlink r:id="rId23" w:history="1">
                               <w:r>
                                 <w:rPr>
                                   <w:rFonts w:ascii="Times New Roman" w:hAnsi="Times New Roman" w:cs="Times New Roman"/>
@@ -3127,7 +3461,7 @@
                         </w:rPr>
                         <w:t xml:space="preserve">Email: </w:t>
                       </w:r>
-                      <w:hyperlink r:id="rId21" w:history="1">
+                      <w:hyperlink r:id="rId24" w:history="1">
                         <w:r>
                           <w:rPr>
                             <w:rFonts w:ascii="Times New Roman" w:hAnsi="Times New Roman" w:cs="Times New Roman"/>
@@ -3313,13 +3647,85 @@
         <mc:AlternateContent>
           <mc:Choice Requires="wps">
             <w:drawing>
-              <wp:anchor distT="0" distB="0" distL="114300" distR="114300" simplePos="0" relativeHeight="251680768" behindDoc="0" locked="0" layoutInCell="1" allowOverlap="1" wp14:anchorId="5230E1ED" wp14:editId="176F30BB">
+              <wp:anchor distT="0" distB="0" distL="114300" distR="114300" simplePos="0" relativeHeight="251681792" behindDoc="0" locked="0" layoutInCell="1" allowOverlap="1" wp14:anchorId="26DA7D30" wp14:editId="136369D8">
                 <wp:simplePos x="0" y="0"/>
                 <wp:positionH relativeFrom="margin">
-                  <wp:posOffset>5720715</wp:posOffset>
+                  <wp:posOffset>5888355</wp:posOffset>
                 </wp:positionH>
                 <wp:positionV relativeFrom="paragraph">
-                  <wp:posOffset>872490</wp:posOffset>
+                  <wp:posOffset>848995</wp:posOffset>
+                </wp:positionV>
+                <wp:extent cx="1002030" cy="0"/>
+                <wp:effectExtent l="0" t="0" r="0" b="0"/>
+                <wp:wrapNone/>
+                <wp:docPr id="525765944" name="Straight Connector 9"/>
+                <wp:cNvGraphicFramePr/>
+                <a:graphic xmlns:a="http://schemas.openxmlformats.org/drawingml/2006/main">
+                  <a:graphicData uri="http://schemas.microsoft.com/office/word/2010/wordprocessingShape">
+                    <wps:wsp>
+                      <wps:cNvCnPr/>
+                      <wps:spPr>
+                        <a:xfrm>
+                          <a:off x="0" y="0"/>
+                          <a:ext cx="1002030" cy="0"/>
+                        </a:xfrm>
+                        <a:prstGeom prst="line">
+                          <a:avLst/>
+                        </a:prstGeom>
+                      </wps:spPr>
+                      <wps:style>
+                        <a:lnRef idx="1">
+                          <a:schemeClr val="dk1"/>
+                        </a:lnRef>
+                        <a:fillRef idx="0">
+                          <a:schemeClr val="dk1"/>
+                        </a:fillRef>
+                        <a:effectRef idx="0">
+                          <a:schemeClr val="dk1"/>
+                        </a:effectRef>
+                        <a:fontRef idx="minor">
+                          <a:schemeClr val="tx1"/>
+                        </a:fontRef>
+                      </wps:style>
+                      <wps:bodyPr/>
+                    </wps:wsp>
+                  </a:graphicData>
+                </a:graphic>
+                <wp14:sizeRelH relativeFrom="margin">
+                  <wp14:pctWidth>0</wp14:pctWidth>
+                </wp14:sizeRelH>
+                <wp14:sizeRelV relativeFrom="margin">
+                  <wp14:pctHeight>0</wp14:pctHeight>
+                </wp14:sizeRelV>
+              </wp:anchor>
+            </w:drawing>
+          </mc:Choice>
+          <mc:Fallback>
+            <w:pict>
+              <v:line w14:anchorId="5D04DF35" id="Straight Connector 9" o:spid="_x0000_s1026" style="position:absolute;z-index:251681792;visibility:visible;mso-wrap-style:square;mso-width-percent:0;mso-height-percent:0;mso-wrap-distance-left:9pt;mso-wrap-distance-top:0;mso-wrap-distance-right:9pt;mso-wrap-distance-bottom:0;mso-position-horizontal:absolute;mso-position-horizontal-relative:margin;mso-position-vertical:absolute;mso-position-vertical-relative:text;mso-width-percent:0;mso-height-percent:0;mso-width-relative:margin;mso-height-relative:margin" from="463.65pt,66.85pt" to="542.55pt,66.85pt" o:gfxdata="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" strokecolor="black [3040]">
+                <w10:wrap anchorx="margin"/>
+              </v:line>
+            </w:pict>
+          </mc:Fallback>
+        </mc:AlternateContent>
+      </w:r>
+      <w:r>
+        <w:rPr>
+          <w:rFonts w:ascii="Times New Roman" w:hAnsi="Times New Roman" w:cs="Times New Roman"/>
+          <w:noProof/>
+          <w:sz w:val="22"/>
+          <w:szCs w:val="22"/>
+        </w:rPr>
+        <mc:AlternateContent>
+          <mc:Choice Requires="wps">
+            <w:drawing>
+              <wp:anchor distT="0" distB="0" distL="114300" distR="114300" simplePos="0" relativeHeight="251680768" behindDoc="0" locked="0" layoutInCell="1" allowOverlap="1" wp14:anchorId="5230E1ED" wp14:editId="056B1139">
+                <wp:simplePos x="0" y="0"/>
+                <wp:positionH relativeFrom="margin">
+                  <wp:posOffset>5791967</wp:posOffset>
+                </wp:positionH>
+                <wp:positionV relativeFrom="paragraph">
+                  <wp:posOffset>611233</wp:posOffset>
                 </wp:positionV>
                 <wp:extent cx="1140460" cy="534670"/>
                 <wp:effectExtent l="0" t="0" r="2540" b="0"/>
@@ -3407,7 +3813,7 @@
           </mc:Choice>
           <mc:Fallback>
             <w:pict>
-              <v:shape w14:anchorId="5230E1ED" id="Text Box 8" o:spid="_x0000_s1028" type="#_x0000_t202" style="position:absolute;left:0;text-align:left;margin-left:450.45pt;margin-top:68.7pt;width:89.8pt;height:42.1pt;z-index:251680768;visibility:visible;mso-wrap-style:square;mso-width-percent:0;mso-height-percent:0;mso-wrap-distance-left:9pt;mso-wrap-distance-top:0;mso-wrap-distance-right:9pt;mso-wrap-distance-bottom:0;mso-position-horizontal:absolute;mso-position-horizontal-relative:margin;mso-position-vertical:absolute;mso-position-vertical-relative:text;mso-width-percent:0;mso-height-percent:0;mso-width-relative:margin;mso-height-relative:margin;v-text-anchor:top" o:gfxdata="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" fillcolor="white [3201]" stroked="f" strokeweight=".5pt">
+              <v:shape w14:anchorId="5230E1ED" id="Text Box 8" o:spid="_x0000_s1028" type="#_x0000_t202" style="position:absolute;left:0;text-align:left;margin-left:456.05pt;margin-top:48.15pt;width:89.8pt;height:42.1pt;z-index:251680768;visibility:visible;mso-wrap-style:square;mso-width-percent:0;mso-height-percent:0;mso-wrap-distance-left:9pt;mso-wrap-distance-top:0;mso-wrap-distance-right:9pt;mso-wrap-distance-bottom:0;mso-position-horizontal:absolute;mso-position-horizontal-relative:margin;mso-position-vertical:absolute;mso-position-vertical-relative:text;mso-width-percent:0;mso-height-percent:0;mso-width-relative:margin;mso-height-relative:margin;v-text-anchor:top" o:gfxdata="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" fillcolor="white [3201]" stroked="f" strokeweight=".5pt">
                 <v:textbox>
                   <w:txbxContent>
                     <w:p>
@@ -3459,84 +3865,12 @@
       <w:r>
         <w:rPr>
           <w:rFonts w:ascii="Times New Roman" w:hAnsi="Times New Roman" w:cs="Times New Roman"/>
-          <w:noProof/>
           <w:sz w:val="22"/>
           <w:szCs w:val="22"/>
         </w:rPr>
-        <mc:AlternateContent>
-          <mc:Choice Requires="wps">
-            <w:drawing>
-              <wp:anchor distT="0" distB="0" distL="114300" distR="114300" simplePos="0" relativeHeight="251681792" behindDoc="0" locked="0" layoutInCell="1" allowOverlap="1" wp14:anchorId="26DA7D30" wp14:editId="0CAE57E9">
-                <wp:simplePos x="0" y="0"/>
-                <wp:positionH relativeFrom="margin">
-                  <wp:posOffset>5817235</wp:posOffset>
-                </wp:positionH>
-                <wp:positionV relativeFrom="paragraph">
-                  <wp:posOffset>1110776</wp:posOffset>
-                </wp:positionV>
-                <wp:extent cx="1002030" cy="0"/>
-                <wp:effectExtent l="0" t="0" r="0" b="0"/>
-                <wp:wrapNone/>
-                <wp:docPr id="525765944" name="Straight Connector 9"/>
-                <wp:cNvGraphicFramePr/>
-                <a:graphic xmlns:a="http://schemas.openxmlformats.org/drawingml/2006/main">
-                  <a:graphicData uri="http://schemas.microsoft.com/office/word/2010/wordprocessingShape">
-                    <wps:wsp>
-                      <wps:cNvCnPr/>
-                      <wps:spPr>
-                        <a:xfrm>
-                          <a:off x="0" y="0"/>
-                          <a:ext cx="1002030" cy="0"/>
-                        </a:xfrm>
-                        <a:prstGeom prst="line">
-                          <a:avLst/>
-                        </a:prstGeom>
-                      </wps:spPr>
-                      <wps:style>
-                        <a:lnRef idx="1">
-                          <a:schemeClr val="dk1"/>
-                        </a:lnRef>
-                        <a:fillRef idx="0">
-                          <a:schemeClr val="dk1"/>
-                        </a:fillRef>
-                        <a:effectRef idx="0">
-                          <a:schemeClr val="dk1"/>
-                        </a:effectRef>
-                        <a:fontRef idx="minor">
-                          <a:schemeClr val="tx1"/>
-                        </a:fontRef>
-                      </wps:style>
-                      <wps:bodyPr/>
-                    </wps:wsp>
-                  </a:graphicData>
-                </a:graphic>
-                <wp14:sizeRelH relativeFrom="margin">
-                  <wp14:pctWidth>0</wp14:pctWidth>
-                </wp14:sizeRelH>
-                <wp14:sizeRelV relativeFrom="margin">
-                  <wp14:pctHeight>0</wp14:pctHeight>
-                </wp14:sizeRelV>
-              </wp:anchor>
-            </w:drawing>
-          </mc:Choice>
-          <mc:Fallback>
-            <w:pict>
-              <v:line w14:anchorId="6E992090" id="Straight Connector 9" o:spid="_x0000_s1026" style="position:absolute;z-index:251681792;visibility:visible;mso-wrap-style:square;mso-width-percent:0;mso-height-percent:0;mso-wrap-distance-left:9pt;mso-wrap-distance-top:0;mso-wrap-distance-right:9pt;mso-wrap-distance-bottom:0;mso-position-horizontal:absolute;mso-position-horizontal-relative:margin;mso-position-vertical:absolute;mso-position-vertical-relative:text;mso-width-percent:0;mso-height-percent:0;mso-width-relative:margin;mso-height-relative:margin" from="458.05pt,87.45pt" to="536.95pt,87.45pt" o:gfxdata="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" strokecolor="black [3040]">
-                <w10:wrap anchorx="margin"/>
-              </v:line>
-            </w:pict>
-          </mc:Fallback>
-        </mc:AlternateContent>
-      </w:r>
-      <w:r>
-        <w:rPr>
-          <w:rFonts w:ascii="Times New Roman" w:hAnsi="Times New Roman" w:cs="Times New Roman"/>
-          <w:sz w:val="22"/>
-          <w:szCs w:val="22"/>
-        </w:rPr>
         <w:t xml:space="preserve">Email: </w:t>
       </w:r>
-      <w:hyperlink r:id="rId22" w:history="1">
+      <w:hyperlink r:id="rId25" w:history="1">
         <w:r>
           <w:rPr>
             <w:rStyle w:val="Hyperlink"/>
@@ -3956,6 +4290,119 @@
     </w:lvl>
   </w:abstractNum>
   <w:abstractNum w:abstractNumId="3" w15:restartNumberingAfterBreak="0">
+    <w:nsid w:val="0C403244"/>
+    <w:multiLevelType w:val="hybridMultilevel"/>
+    <w:tmpl w:val="2FF63682"/>
+    <w:lvl w:ilvl="0" w:tplc="04090001">
+      <w:start w:val="1"/>
+      <w:numFmt w:val="bullet"/>
+      <w:lvlText w:val=""/>
+      <w:lvlJc w:val="left"/>
+      <w:pPr>
+        <w:ind w:left="1080" w:hanging="360"/>
+      </w:pPr>
+      <w:rPr>
+        <w:rFonts w:ascii="Symbol" w:hAnsi="Symbol" w:hint="default"/>
+      </w:rPr>
+    </w:lvl>
+    <w:lvl w:ilvl="1" w:tplc="04090003" w:tentative="1">
+      <w:start w:val="1"/>
+      <w:numFmt w:val="bullet"/>
+      <w:lvlText w:val="o"/>
+      <w:lvlJc w:val="left"/>
+      <w:pPr>
+        <w:ind w:left="1800" w:hanging="360"/>
+      </w:pPr>
+      <w:rPr>
+        <w:rFonts w:ascii="Courier New" w:hAnsi="Courier New" w:cs="Courier New" w:hint="default"/>
+      </w:rPr>
+    </w:lvl>
+    <w:lvl w:ilvl="2" w:tplc="04090005" w:tentative="1">
+      <w:start w:val="1"/>
+      <w:numFmt w:val="bullet"/>
+      <w:lvlText w:val=""/>
+      <w:lvlJc w:val="left"/>
+      <w:pPr>
+        <w:ind w:left="2520" w:hanging="360"/>
+      </w:pPr>
+      <w:rPr>
+        <w:rFonts w:ascii="Wingdings" w:hAnsi="Wingdings" w:hint="default"/>
+      </w:rPr>
+    </w:lvl>
+    <w:lvl w:ilvl="3" w:tplc="04090001" w:tentative="1">
+      <w:start w:val="1"/>
+      <w:numFmt w:val="bullet"/>
+      <w:lvlText w:val=""/>
+      <w:lvlJc w:val="left"/>
+      <w:pPr>
+        <w:ind w:left="3240" w:hanging="360"/>
+      </w:pPr>
+      <w:rPr>
+        <w:rFonts w:ascii="Symbol" w:hAnsi="Symbol" w:hint="default"/>
+      </w:rPr>
+    </w:lvl>
+    <w:lvl w:ilvl="4" w:tplc="04090003" w:tentative="1">
+      <w:start w:val="1"/>
+      <w:numFmt w:val="bullet"/>
+      <w:lvlText w:val="o"/>
+      <w:lvlJc w:val="left"/>
+      <w:pPr>
+        <w:ind w:left="3960" w:hanging="360"/>
+      </w:pPr>
+      <w:rPr>
+        <w:rFonts w:ascii="Courier New" w:hAnsi="Courier New" w:cs="Courier New" w:hint="default"/>
+      </w:rPr>
+    </w:lvl>
+    <w:lvl w:ilvl="5" w:tplc="04090005" w:tentative="1">
+      <w:start w:val="1"/>
+      <w:numFmt w:val="bullet"/>
+      <w:lvlText w:val=""/>
+      <w:lvlJc w:val="left"/>
+      <w:pPr>
+        <w:ind w:left="4680" w:hanging="360"/>
+      </w:pPr>
+      <w:rPr>
+        <w:rFonts w:ascii="Wingdings" w:hAnsi="Wingdings" w:hint="default"/>
+      </w:rPr>
+    </w:lvl>
+    <w:lvl w:ilvl="6" w:tplc="04090001" w:tentative="1">
+      <w:start w:val="1"/>
+      <w:numFmt w:val="bullet"/>
+      <w:lvlText w:val=""/>
+      <w:lvlJc w:val="left"/>
+      <w:pPr>
+        <w:ind w:left="5400" w:hanging="360"/>
+      </w:pPr>
+      <w:rPr>
+        <w:rFonts w:ascii="Symbol" w:hAnsi="Symbol" w:hint="default"/>
+      </w:rPr>
+    </w:lvl>
+    <w:lvl w:ilvl="7" w:tplc="04090003" w:tentative="1">
+      <w:start w:val="1"/>
+      <w:numFmt w:val="bullet"/>
+      <w:lvlText w:val="o"/>
+      <w:lvlJc w:val="left"/>
+      <w:pPr>
+        <w:ind w:left="6120" w:hanging="360"/>
+      </w:pPr>
+      <w:rPr>
+        <w:rFonts w:ascii="Courier New" w:hAnsi="Courier New" w:cs="Courier New" w:hint="default"/>
+      </w:rPr>
+    </w:lvl>
+    <w:lvl w:ilvl="8" w:tplc="04090005" w:tentative="1">
+      <w:start w:val="1"/>
+      <w:numFmt w:val="bullet"/>
+      <w:lvlText w:val=""/>
+      <w:lvlJc w:val="left"/>
+      <w:pPr>
+        <w:ind w:left="6840" w:hanging="360"/>
+      </w:pPr>
+      <w:rPr>
+        <w:rFonts w:ascii="Wingdings" w:hAnsi="Wingdings" w:hint="default"/>
+      </w:rPr>
+    </w:lvl>
+  </w:abstractNum>
+  <w:abstractNum w:abstractNumId="4" w15:restartNumberingAfterBreak="0">
     <w:nsid w:val="0CD73BAA"/>
     <w:multiLevelType w:val="hybridMultilevel"/>
     <w:tmpl w:val="75F84094"/>
@@ -4068,7 +4515,7 @@
       </w:rPr>
     </w:lvl>
   </w:abstractNum>
-  <w:abstractNum w:abstractNumId="4" w15:restartNumberingAfterBreak="0">
+  <w:abstractNum w:abstractNumId="5" w15:restartNumberingAfterBreak="0">
     <w:nsid w:val="116D30E1"/>
     <w:multiLevelType w:val="hybridMultilevel"/>
     <w:tmpl w:val="AE6CF12E"/>
@@ -4184,7 +4631,7 @@
       </w:rPr>
     </w:lvl>
   </w:abstractNum>
-  <w:abstractNum w:abstractNumId="5" w15:restartNumberingAfterBreak="0">
+  <w:abstractNum w:abstractNumId="6" w15:restartNumberingAfterBreak="0">
     <w:nsid w:val="1313760A"/>
     <w:multiLevelType w:val="hybridMultilevel"/>
     <w:tmpl w:val="76EE0FA2"/>
@@ -4297,7 +4744,156 @@
       </w:rPr>
     </w:lvl>
   </w:abstractNum>
-  <w:abstractNum w:abstractNumId="6" w15:restartNumberingAfterBreak="0">
+  <w:abstractNum w:abstractNumId="7" w15:restartNumberingAfterBreak="0">
+    <w:nsid w:val="15157097"/>
+    <w:multiLevelType w:val="multilevel"/>
+    <w:tmpl w:val="4B76719C"/>
+    <w:lvl w:ilvl="0">
+      <w:start w:val="1"/>
+      <w:numFmt w:val="bullet"/>
+      <w:lvlText w:val=""/>
+      <w:lvlJc w:val="left"/>
+      <w:pPr>
+        <w:tabs>
+          <w:tab w:val="num" w:pos="720"/>
+        </w:tabs>
+        <w:ind w:left="720" w:hanging="360"/>
+      </w:pPr>
+      <w:rPr>
+        <w:rFonts w:ascii="Symbol" w:hAnsi="Symbol" w:hint="default"/>
+        <w:sz w:val="20"/>
+      </w:rPr>
+    </w:lvl>
+    <w:lvl w:ilvl="1" w:tentative="1">
+      <w:start w:val="1"/>
+      <w:numFmt w:val="bullet"/>
+      <w:lvlText w:val="o"/>
+      <w:lvlJc w:val="left"/>
+      <w:pPr>
+        <w:tabs>
+          <w:tab w:val="num" w:pos="1440"/>
+        </w:tabs>
+        <w:ind w:left="1440" w:hanging="360"/>
+      </w:pPr>
+      <w:rPr>
+        <w:rFonts w:ascii="Courier New" w:hAnsi="Courier New" w:hint="default"/>
+        <w:sz w:val="20"/>
+      </w:rPr>
+    </w:lvl>
+    <w:lvl w:ilvl="2" w:tentative="1">
+      <w:start w:val="1"/>
+      <w:numFmt w:val="bullet"/>
+      <w:lvlText w:val=""/>
+      <w:lvlJc w:val="left"/>
+      <w:pPr>
+        <w:tabs>
+          <w:tab w:val="num" w:pos="2160"/>
+        </w:tabs>
+        <w:ind w:left="2160" w:hanging="360"/>
+      </w:pPr>
+      <w:rPr>
+        <w:rFonts w:ascii="Wingdings" w:hAnsi="Wingdings" w:hint="default"/>
+        <w:sz w:val="20"/>
+      </w:rPr>
+    </w:lvl>
+    <w:lvl w:ilvl="3" w:tentative="1">
+      <w:start w:val="1"/>
+      <w:numFmt w:val="bullet"/>
+      <w:lvlText w:val=""/>
+      <w:lvlJc w:val="left"/>
+      <w:pPr>
+        <w:tabs>
+          <w:tab w:val="num" w:pos="2880"/>
+        </w:tabs>
+        <w:ind w:left="2880" w:hanging="360"/>
+      </w:pPr>
+      <w:rPr>
+        <w:rFonts w:ascii="Wingdings" w:hAnsi="Wingdings" w:hint="default"/>
+        <w:sz w:val="20"/>
+      </w:rPr>
+    </w:lvl>
+    <w:lvl w:ilvl="4" w:tentative="1">
+      <w:start w:val="1"/>
+      <w:numFmt w:val="bullet"/>
+      <w:lvlText w:val=""/>
+      <w:lvlJc w:val="left"/>
+      <w:pPr>
+        <w:tabs>
+          <w:tab w:val="num" w:pos="3600"/>
+        </w:tabs>
+        <w:ind w:left="3600" w:hanging="360"/>
+      </w:pPr>
+      <w:rPr>
+        <w:rFonts w:ascii="Wingdings" w:hAnsi="Wingdings" w:hint="default"/>
+        <w:sz w:val="20"/>
+      </w:rPr>
+    </w:lvl>
+    <w:lvl w:ilvl="5" w:tentative="1">
+      <w:start w:val="1"/>
+      <w:numFmt w:val="bullet"/>
+      <w:lvlText w:val=""/>
+      <w:lvlJc w:val="left"/>
+      <w:pPr>
+        <w:tabs>
+          <w:tab w:val="num" w:pos="4320"/>
+        </w:tabs>
+        <w:ind w:left="4320" w:hanging="360"/>
+      </w:pPr>
+      <w:rPr>
+        <w:rFonts w:ascii="Wingdings" w:hAnsi="Wingdings" w:hint="default"/>
+        <w:sz w:val="20"/>
+      </w:rPr>
+    </w:lvl>
+    <w:lvl w:ilvl="6" w:tentative="1">
+      <w:start w:val="1"/>
+      <w:numFmt w:val="bullet"/>
+      <w:lvlText w:val=""/>
+      <w:lvlJc w:val="left"/>
+      <w:pPr>
+        <w:tabs>
+          <w:tab w:val="num" w:pos="5040"/>
+        </w:tabs>
+        <w:ind w:left="5040" w:hanging="360"/>
+      </w:pPr>
+      <w:rPr>
+        <w:rFonts w:ascii="Wingdings" w:hAnsi="Wingdings" w:hint="default"/>
+        <w:sz w:val="20"/>
+      </w:rPr>
+    </w:lvl>
+    <w:lvl w:ilvl="7" w:tentative="1">
+      <w:start w:val="1"/>
+      <w:numFmt w:val="bullet"/>
+      <w:lvlText w:val=""/>
+      <w:lvlJc w:val="left"/>
+      <w:pPr>
+        <w:tabs>
+          <w:tab w:val="num" w:pos="5760"/>
+        </w:tabs>
+        <w:ind w:left="5760" w:hanging="360"/>
+      </w:pPr>
+      <w:rPr>
+        <w:rFonts w:ascii="Wingdings" w:hAnsi="Wingdings" w:hint="default"/>
+        <w:sz w:val="20"/>
+      </w:rPr>
+    </w:lvl>
+    <w:lvl w:ilvl="8" w:tentative="1">
+      <w:start w:val="1"/>
+      <w:numFmt w:val="bullet"/>
+      <w:lvlText w:val=""/>
+      <w:lvlJc w:val="left"/>
+      <w:pPr>
+        <w:tabs>
+          <w:tab w:val="num" w:pos="6480"/>
+        </w:tabs>
+        <w:ind w:left="6480" w:hanging="360"/>
+      </w:pPr>
+      <w:rPr>
+        <w:rFonts w:ascii="Wingdings" w:hAnsi="Wingdings" w:hint="default"/>
+        <w:sz w:val="20"/>
+      </w:rPr>
+    </w:lvl>
+  </w:abstractNum>
+  <w:abstractNum w:abstractNumId="8" w15:restartNumberingAfterBreak="0">
     <w:nsid w:val="17E97933"/>
     <w:multiLevelType w:val="hybridMultilevel"/>
     <w:tmpl w:val="EC66AD98"/>
@@ -4410,7 +5006,123 @@
       </w:rPr>
     </w:lvl>
   </w:abstractNum>
-  <w:abstractNum w:abstractNumId="7" w15:restartNumberingAfterBreak="0">
+  <w:abstractNum w:abstractNumId="9" w15:restartNumberingAfterBreak="0">
+    <w:nsid w:val="1B9850E8"/>
+    <w:multiLevelType w:val="hybridMultilevel"/>
+    <w:tmpl w:val="5CB4C6F6"/>
+    <w:lvl w:ilvl="0" w:tplc="308CE9D2">
+      <w:start w:val="1"/>
+      <w:numFmt w:val="bullet"/>
+      <w:lvlText w:val=""/>
+      <w:lvlJc w:val="left"/>
+      <w:pPr>
+        <w:ind w:left="720" w:hanging="360"/>
+      </w:pPr>
+      <w:rPr>
+        <w:rFonts w:ascii="Wingdings" w:hAnsi="Wingdings" w:hint="default"/>
+        <w:b/>
+        <w:i w:val="0"/>
+        <w:sz w:val="20"/>
+      </w:rPr>
+    </w:lvl>
+    <w:lvl w:ilvl="1" w:tplc="04090003" w:tentative="1">
+      <w:start w:val="1"/>
+      <w:numFmt w:val="bullet"/>
+      <w:lvlText w:val="o"/>
+      <w:lvlJc w:val="left"/>
+      <w:pPr>
+        <w:ind w:left="1440" w:hanging="360"/>
+      </w:pPr>
+      <w:rPr>
+        <w:rFonts w:ascii="Courier New" w:hAnsi="Courier New" w:cs="Courier New" w:hint="default"/>
+      </w:rPr>
+    </w:lvl>
+    <w:lvl w:ilvl="2" w:tplc="04090005" w:tentative="1">
+      <w:start w:val="1"/>
+      <w:numFmt w:val="bullet"/>
+      <w:lvlText w:val=""/>
+      <w:lvlJc w:val="left"/>
+      <w:pPr>
+        <w:ind w:left="2160" w:hanging="360"/>
+      </w:pPr>
+      <w:rPr>
+        <w:rFonts w:ascii="Wingdings" w:hAnsi="Wingdings" w:hint="default"/>
+      </w:rPr>
+    </w:lvl>
+    <w:lvl w:ilvl="3" w:tplc="04090001" w:tentative="1">
+      <w:start w:val="1"/>
+      <w:numFmt w:val="bullet"/>
+      <w:lvlText w:val=""/>
+      <w:lvlJc w:val="left"/>
+      <w:pPr>
+        <w:ind w:left="2880" w:hanging="360"/>
+      </w:pPr>
+      <w:rPr>
+        <w:rFonts w:ascii="Symbol" w:hAnsi="Symbol" w:hint="default"/>
+      </w:rPr>
+    </w:lvl>
+    <w:lvl w:ilvl="4" w:tplc="04090003" w:tentative="1">
+      <w:start w:val="1"/>
+      <w:numFmt w:val="bullet"/>
+      <w:lvlText w:val="o"/>
+      <w:lvlJc w:val="left"/>
+      <w:pPr>
+        <w:ind w:left="3600" w:hanging="360"/>
+      </w:pPr>
+      <w:rPr>
+        <w:rFonts w:ascii="Courier New" w:hAnsi="Courier New" w:cs="Courier New" w:hint="default"/>
+      </w:rPr>
+    </w:lvl>
+    <w:lvl w:ilvl="5" w:tplc="04090005" w:tentative="1">
+      <w:start w:val="1"/>
+      <w:numFmt w:val="bullet"/>
+      <w:lvlText w:val=""/>
+      <w:lvlJc w:val="left"/>
+      <w:pPr>
+        <w:ind w:left="4320" w:hanging="360"/>
+      </w:pPr>
+      <w:rPr>
+        <w:rFonts w:ascii="Wingdings" w:hAnsi="Wingdings" w:hint="default"/>
+      </w:rPr>
+    </w:lvl>
+    <w:lvl w:ilvl="6" w:tplc="04090001" w:tentative="1">
+      <w:start w:val="1"/>
+      <w:numFmt w:val="bullet"/>
+      <w:lvlText w:val=""/>
+      <w:lvlJc w:val="left"/>
+      <w:pPr>
+        <w:ind w:left="5040" w:hanging="360"/>
+      </w:pPr>
+      <w:rPr>
+        <w:rFonts w:ascii="Symbol" w:hAnsi="Symbol" w:hint="default"/>
+      </w:rPr>
+    </w:lvl>
+    <w:lvl w:ilvl="7" w:tplc="04090003" w:tentative="1">
+      <w:start w:val="1"/>
+      <w:numFmt w:val="bullet"/>
+      <w:lvlText w:val="o"/>
+      <w:lvlJc w:val="left"/>
+      <w:pPr>
+        <w:ind w:left="5760" w:hanging="360"/>
+      </w:pPr>
+      <w:rPr>
+        <w:rFonts w:ascii="Courier New" w:hAnsi="Courier New" w:cs="Courier New" w:hint="default"/>
+      </w:rPr>
+    </w:lvl>
+    <w:lvl w:ilvl="8" w:tplc="04090005" w:tentative="1">
+      <w:start w:val="1"/>
+      <w:numFmt w:val="bullet"/>
+      <w:lvlText w:val=""/>
+      <w:lvlJc w:val="left"/>
+      <w:pPr>
+        <w:ind w:left="6480" w:hanging="360"/>
+      </w:pPr>
+      <w:rPr>
+        <w:rFonts w:ascii="Wingdings" w:hAnsi="Wingdings" w:hint="default"/>
+      </w:rPr>
+    </w:lvl>
+  </w:abstractNum>
+  <w:abstractNum w:abstractNumId="10" w15:restartNumberingAfterBreak="0">
     <w:nsid w:val="206E54C4"/>
     <w:multiLevelType w:val="hybridMultilevel"/>
     <w:tmpl w:val="D1647DCC"/>
@@ -4523,7 +5235,7 @@
       </w:rPr>
     </w:lvl>
   </w:abstractNum>
-  <w:abstractNum w:abstractNumId="8" w15:restartNumberingAfterBreak="0">
+  <w:abstractNum w:abstractNumId="11" w15:restartNumberingAfterBreak="0">
     <w:nsid w:val="21D47BD6"/>
     <w:multiLevelType w:val="hybridMultilevel"/>
     <w:tmpl w:val="A8C08240"/>
@@ -4638,7 +5350,7 @@
       </w:rPr>
     </w:lvl>
   </w:abstractNum>
-  <w:abstractNum w:abstractNumId="9" w15:restartNumberingAfterBreak="0">
+  <w:abstractNum w:abstractNumId="12" w15:restartNumberingAfterBreak="0">
     <w:nsid w:val="270474A8"/>
     <w:multiLevelType w:val="hybridMultilevel"/>
     <w:tmpl w:val="4CDC1E42"/>
@@ -4751,7 +5463,7 @@
       </w:rPr>
     </w:lvl>
   </w:abstractNum>
-  <w:abstractNum w:abstractNumId="10" w15:restartNumberingAfterBreak="0">
+  <w:abstractNum w:abstractNumId="13" w15:restartNumberingAfterBreak="0">
     <w:nsid w:val="27290DC9"/>
     <w:multiLevelType w:val="hybridMultilevel"/>
     <w:tmpl w:val="FF4E1130"/>
@@ -4867,7 +5579,7 @@
       </w:rPr>
     </w:lvl>
   </w:abstractNum>
-  <w:abstractNum w:abstractNumId="11" w15:restartNumberingAfterBreak="0">
+  <w:abstractNum w:abstractNumId="14" w15:restartNumberingAfterBreak="0">
     <w:nsid w:val="28004CAB"/>
     <w:multiLevelType w:val="hybridMultilevel"/>
     <w:tmpl w:val="DE4A71F4"/>
@@ -4980,7 +5692,7 @@
       </w:rPr>
     </w:lvl>
   </w:abstractNum>
-  <w:abstractNum w:abstractNumId="12" w15:restartNumberingAfterBreak="0">
+  <w:abstractNum w:abstractNumId="15" w15:restartNumberingAfterBreak="0">
     <w:nsid w:val="2A1F34A2"/>
     <w:multiLevelType w:val="hybridMultilevel"/>
     <w:tmpl w:val="DD721188"/>
@@ -5096,7 +5808,7 @@
       </w:rPr>
     </w:lvl>
   </w:abstractNum>
-  <w:abstractNum w:abstractNumId="13" w15:restartNumberingAfterBreak="0">
+  <w:abstractNum w:abstractNumId="16" w15:restartNumberingAfterBreak="0">
     <w:nsid w:val="2A93795A"/>
     <w:multiLevelType w:val="hybridMultilevel"/>
     <w:tmpl w:val="A7889FF2"/>
@@ -5210,7 +5922,7 @@
       </w:rPr>
     </w:lvl>
   </w:abstractNum>
-  <w:abstractNum w:abstractNumId="14" w15:restartNumberingAfterBreak="0">
+  <w:abstractNum w:abstractNumId="17" w15:restartNumberingAfterBreak="0">
     <w:nsid w:val="2BB16F1B"/>
     <w:multiLevelType w:val="hybridMultilevel"/>
     <w:tmpl w:val="4A9486C2"/>
@@ -5327,7 +6039,7 @@
       </w:rPr>
     </w:lvl>
   </w:abstractNum>
-  <w:abstractNum w:abstractNumId="15" w15:restartNumberingAfterBreak="0">
+  <w:abstractNum w:abstractNumId="18" w15:restartNumberingAfterBreak="0">
     <w:nsid w:val="2C3232FE"/>
     <w:multiLevelType w:val="hybridMultilevel"/>
     <w:tmpl w:val="48F07CC6"/>
@@ -5443,7 +6155,7 @@
       </w:rPr>
     </w:lvl>
   </w:abstractNum>
-  <w:abstractNum w:abstractNumId="16" w15:restartNumberingAfterBreak="0">
+  <w:abstractNum w:abstractNumId="19" w15:restartNumberingAfterBreak="0">
     <w:nsid w:val="2C46436D"/>
     <w:multiLevelType w:val="hybridMultilevel"/>
     <w:tmpl w:val="E3EC5D1A"/>
@@ -5556,7 +6268,7 @@
       </w:rPr>
     </w:lvl>
   </w:abstractNum>
-  <w:abstractNum w:abstractNumId="17" w15:restartNumberingAfterBreak="0">
+  <w:abstractNum w:abstractNumId="20" w15:restartNumberingAfterBreak="0">
     <w:nsid w:val="2DED0F0C"/>
     <w:multiLevelType w:val="hybridMultilevel"/>
     <w:tmpl w:val="E3D8769E"/>
@@ -5669,7 +6381,7 @@
       </w:rPr>
     </w:lvl>
   </w:abstractNum>
-  <w:abstractNum w:abstractNumId="18" w15:restartNumberingAfterBreak="0">
+  <w:abstractNum w:abstractNumId="21" w15:restartNumberingAfterBreak="0">
     <w:nsid w:val="32180D1F"/>
     <w:multiLevelType w:val="hybridMultilevel"/>
     <w:tmpl w:val="0B64664C"/>
@@ -5782,7 +6494,7 @@
       </w:rPr>
     </w:lvl>
   </w:abstractNum>
-  <w:abstractNum w:abstractNumId="19" w15:restartNumberingAfterBreak="0">
+  <w:abstractNum w:abstractNumId="22" w15:restartNumberingAfterBreak="0">
     <w:nsid w:val="33242DCC"/>
     <w:multiLevelType w:val="hybridMultilevel"/>
     <w:tmpl w:val="B38CA0BE"/>
@@ -5897,7 +6609,7 @@
       </w:rPr>
     </w:lvl>
   </w:abstractNum>
-  <w:abstractNum w:abstractNumId="20" w15:restartNumberingAfterBreak="0">
+  <w:abstractNum w:abstractNumId="23" w15:restartNumberingAfterBreak="0">
     <w:nsid w:val="33266D12"/>
     <w:multiLevelType w:val="hybridMultilevel"/>
     <w:tmpl w:val="4FE20092"/>
@@ -6013,7 +6725,7 @@
       </w:rPr>
     </w:lvl>
   </w:abstractNum>
-  <w:abstractNum w:abstractNumId="21" w15:restartNumberingAfterBreak="0">
+  <w:abstractNum w:abstractNumId="24" w15:restartNumberingAfterBreak="0">
     <w:nsid w:val="34DD3392"/>
     <w:multiLevelType w:val="hybridMultilevel"/>
     <w:tmpl w:val="ED94E958"/>
@@ -6129,7 +6841,7 @@
       </w:rPr>
     </w:lvl>
   </w:abstractNum>
-  <w:abstractNum w:abstractNumId="22" w15:restartNumberingAfterBreak="0">
+  <w:abstractNum w:abstractNumId="25" w15:restartNumberingAfterBreak="0">
     <w:nsid w:val="395E0B55"/>
     <w:multiLevelType w:val="hybridMultilevel"/>
     <w:tmpl w:val="D1D2FAB2"/>
@@ -6242,7 +6954,7 @@
       </w:rPr>
     </w:lvl>
   </w:abstractNum>
-  <w:abstractNum w:abstractNumId="23" w15:restartNumberingAfterBreak="0">
+  <w:abstractNum w:abstractNumId="26" w15:restartNumberingAfterBreak="0">
     <w:nsid w:val="3E6E315B"/>
     <w:multiLevelType w:val="hybridMultilevel"/>
     <w:tmpl w:val="6E60FA12"/>
@@ -6355,7 +7067,7 @@
       </w:rPr>
     </w:lvl>
   </w:abstractNum>
-  <w:abstractNum w:abstractNumId="24" w15:restartNumberingAfterBreak="0">
+  <w:abstractNum w:abstractNumId="27" w15:restartNumberingAfterBreak="0">
     <w:nsid w:val="3F12537B"/>
     <w:multiLevelType w:val="hybridMultilevel"/>
     <w:tmpl w:val="B9186B18"/>
@@ -6472,7 +7184,7 @@
       </w:rPr>
     </w:lvl>
   </w:abstractNum>
-  <w:abstractNum w:abstractNumId="25" w15:restartNumberingAfterBreak="0">
+  <w:abstractNum w:abstractNumId="28" w15:restartNumberingAfterBreak="0">
     <w:nsid w:val="40745FD4"/>
     <w:multiLevelType w:val="multilevel"/>
     <w:tmpl w:val="230AAFA8"/>
@@ -6621,7 +7333,7 @@
       </w:rPr>
     </w:lvl>
   </w:abstractNum>
-  <w:abstractNum w:abstractNumId="26" w15:restartNumberingAfterBreak="0">
+  <w:abstractNum w:abstractNumId="29" w15:restartNumberingAfterBreak="0">
     <w:nsid w:val="449C62A1"/>
     <w:multiLevelType w:val="hybridMultilevel"/>
     <w:tmpl w:val="FCDAF1CC"/>
@@ -6734,7 +7446,7 @@
       </w:rPr>
     </w:lvl>
   </w:abstractNum>
-  <w:abstractNum w:abstractNumId="27" w15:restartNumberingAfterBreak="0">
+  <w:abstractNum w:abstractNumId="30" w15:restartNumberingAfterBreak="0">
     <w:nsid w:val="46712360"/>
     <w:multiLevelType w:val="hybridMultilevel"/>
     <w:tmpl w:val="94DEB71C"/>
@@ -6850,7 +7562,7 @@
       </w:rPr>
     </w:lvl>
   </w:abstractNum>
-  <w:abstractNum w:abstractNumId="28" w15:restartNumberingAfterBreak="0">
+  <w:abstractNum w:abstractNumId="31" w15:restartNumberingAfterBreak="0">
     <w:nsid w:val="49AF0D37"/>
     <w:multiLevelType w:val="hybridMultilevel"/>
     <w:tmpl w:val="4A96F47A"/>
@@ -6963,7 +7675,7 @@
       </w:rPr>
     </w:lvl>
   </w:abstractNum>
-  <w:abstractNum w:abstractNumId="29" w15:restartNumberingAfterBreak="0">
+  <w:abstractNum w:abstractNumId="32" w15:restartNumberingAfterBreak="0">
     <w:nsid w:val="51A26A80"/>
     <w:multiLevelType w:val="hybridMultilevel"/>
     <w:tmpl w:val="17046084"/>
@@ -7080,7 +7792,7 @@
       </w:rPr>
     </w:lvl>
   </w:abstractNum>
-  <w:abstractNum w:abstractNumId="30" w15:restartNumberingAfterBreak="0">
+  <w:abstractNum w:abstractNumId="33" w15:restartNumberingAfterBreak="0">
     <w:nsid w:val="52D9277D"/>
     <w:multiLevelType w:val="hybridMultilevel"/>
     <w:tmpl w:val="DC50A698"/>
@@ -7196,7 +7908,7 @@
       </w:rPr>
     </w:lvl>
   </w:abstractNum>
-  <w:abstractNum w:abstractNumId="31" w15:restartNumberingAfterBreak="0">
+  <w:abstractNum w:abstractNumId="34" w15:restartNumberingAfterBreak="0">
     <w:nsid w:val="539A777F"/>
     <w:multiLevelType w:val="hybridMultilevel"/>
     <w:tmpl w:val="25905716"/>
@@ -7310,7 +8022,7 @@
       </w:rPr>
     </w:lvl>
   </w:abstractNum>
-  <w:abstractNum w:abstractNumId="32" w15:restartNumberingAfterBreak="0">
+  <w:abstractNum w:abstractNumId="35" w15:restartNumberingAfterBreak="0">
     <w:nsid w:val="56984F39"/>
     <w:multiLevelType w:val="hybridMultilevel"/>
     <w:tmpl w:val="15D0472A"/>
@@ -7427,7 +8139,7 @@
       </w:rPr>
     </w:lvl>
   </w:abstractNum>
-  <w:abstractNum w:abstractNumId="33" w15:restartNumberingAfterBreak="0">
+  <w:abstractNum w:abstractNumId="36" w15:restartNumberingAfterBreak="0">
     <w:nsid w:val="5B6E57C8"/>
     <w:multiLevelType w:val="hybridMultilevel"/>
     <w:tmpl w:val="B162AAF4"/>
@@ -7543,7 +8255,7 @@
       </w:rPr>
     </w:lvl>
   </w:abstractNum>
-  <w:abstractNum w:abstractNumId="34" w15:restartNumberingAfterBreak="0">
+  <w:abstractNum w:abstractNumId="37" w15:restartNumberingAfterBreak="0">
     <w:nsid w:val="61FB30A4"/>
     <w:multiLevelType w:val="multilevel"/>
     <w:tmpl w:val="7FEAC45E"/>
@@ -7692,7 +8404,7 @@
       </w:rPr>
     </w:lvl>
   </w:abstractNum>
-  <w:abstractNum w:abstractNumId="35" w15:restartNumberingAfterBreak="0">
+  <w:abstractNum w:abstractNumId="38" w15:restartNumberingAfterBreak="0">
     <w:nsid w:val="624C36A8"/>
     <w:multiLevelType w:val="hybridMultilevel"/>
     <w:tmpl w:val="30DE320C"/>
@@ -7805,7 +8517,7 @@
       </w:rPr>
     </w:lvl>
   </w:abstractNum>
-  <w:abstractNum w:abstractNumId="36" w15:restartNumberingAfterBreak="0">
+  <w:abstractNum w:abstractNumId="39" w15:restartNumberingAfterBreak="0">
     <w:nsid w:val="64740A93"/>
     <w:multiLevelType w:val="hybridMultilevel"/>
     <w:tmpl w:val="A6C2D57C"/>
@@ -7921,7 +8633,7 @@
       </w:rPr>
     </w:lvl>
   </w:abstractNum>
-  <w:abstractNum w:abstractNumId="37" w15:restartNumberingAfterBreak="0">
+  <w:abstractNum w:abstractNumId="40" w15:restartNumberingAfterBreak="0">
     <w:nsid w:val="6739441C"/>
     <w:multiLevelType w:val="hybridMultilevel"/>
     <w:tmpl w:val="2CE0DE3E"/>
@@ -8034,7 +8746,7 @@
       </w:rPr>
     </w:lvl>
   </w:abstractNum>
-  <w:abstractNum w:abstractNumId="38" w15:restartNumberingAfterBreak="0">
+  <w:abstractNum w:abstractNumId="41" w15:restartNumberingAfterBreak="0">
     <w:nsid w:val="689978F2"/>
     <w:multiLevelType w:val="hybridMultilevel"/>
     <w:tmpl w:val="67F48F6C"/>
@@ -8147,7 +8859,7 @@
       </w:rPr>
     </w:lvl>
   </w:abstractNum>
-  <w:abstractNum w:abstractNumId="39" w15:restartNumberingAfterBreak="0">
+  <w:abstractNum w:abstractNumId="42" w15:restartNumberingAfterBreak="0">
     <w:nsid w:val="6C5831EF"/>
     <w:multiLevelType w:val="hybridMultilevel"/>
     <w:tmpl w:val="AD7CE614"/>
@@ -8263,7 +8975,7 @@
       </w:rPr>
     </w:lvl>
   </w:abstractNum>
-  <w:abstractNum w:abstractNumId="40" w15:restartNumberingAfterBreak="0">
+  <w:abstractNum w:abstractNumId="43" w15:restartNumberingAfterBreak="0">
     <w:nsid w:val="6C8744AE"/>
     <w:multiLevelType w:val="hybridMultilevel"/>
     <w:tmpl w:val="EDDCB3D8"/>
@@ -8376,7 +9088,7 @@
       </w:rPr>
     </w:lvl>
   </w:abstractNum>
-  <w:abstractNum w:abstractNumId="41" w15:restartNumberingAfterBreak="0">
+  <w:abstractNum w:abstractNumId="44" w15:restartNumberingAfterBreak="0">
     <w:nsid w:val="6CF70049"/>
     <w:multiLevelType w:val="hybridMultilevel"/>
     <w:tmpl w:val="C0565840"/>
@@ -8489,7 +9201,7 @@
       </w:rPr>
     </w:lvl>
   </w:abstractNum>
-  <w:abstractNum w:abstractNumId="42" w15:restartNumberingAfterBreak="0">
+  <w:abstractNum w:abstractNumId="45" w15:restartNumberingAfterBreak="0">
     <w:nsid w:val="6E684EFC"/>
     <w:multiLevelType w:val="hybridMultilevel"/>
     <w:tmpl w:val="A6603BCC"/>
@@ -8602,7 +9314,7 @@
       </w:rPr>
     </w:lvl>
   </w:abstractNum>
-  <w:abstractNum w:abstractNumId="43" w15:restartNumberingAfterBreak="0">
+  <w:abstractNum w:abstractNumId="46" w15:restartNumberingAfterBreak="0">
     <w:nsid w:val="713124D2"/>
     <w:multiLevelType w:val="hybridMultilevel"/>
     <w:tmpl w:val="9CAAAB92"/>
@@ -8719,7 +9431,7 @@
       </w:rPr>
     </w:lvl>
   </w:abstractNum>
-  <w:abstractNum w:abstractNumId="44" w15:restartNumberingAfterBreak="0">
+  <w:abstractNum w:abstractNumId="47" w15:restartNumberingAfterBreak="0">
     <w:nsid w:val="72993A4F"/>
     <w:multiLevelType w:val="hybridMultilevel"/>
     <w:tmpl w:val="30AEE182"/>
@@ -8832,7 +9544,7 @@
       </w:rPr>
     </w:lvl>
   </w:abstractNum>
-  <w:abstractNum w:abstractNumId="45" w15:restartNumberingAfterBreak="0">
+  <w:abstractNum w:abstractNumId="48" w15:restartNumberingAfterBreak="0">
     <w:nsid w:val="72FE591A"/>
     <w:multiLevelType w:val="hybridMultilevel"/>
     <w:tmpl w:val="268C2C24"/>
@@ -8945,7 +9657,7 @@
       </w:rPr>
     </w:lvl>
   </w:abstractNum>
-  <w:abstractNum w:abstractNumId="46" w15:restartNumberingAfterBreak="0">
+  <w:abstractNum w:abstractNumId="49" w15:restartNumberingAfterBreak="0">
     <w:nsid w:val="759F1FF9"/>
     <w:multiLevelType w:val="hybridMultilevel"/>
     <w:tmpl w:val="055871E2"/>
@@ -9060,7 +9772,7 @@
       </w:rPr>
     </w:lvl>
   </w:abstractNum>
-  <w:abstractNum w:abstractNumId="47" w15:restartNumberingAfterBreak="0">
+  <w:abstractNum w:abstractNumId="50" w15:restartNumberingAfterBreak="0">
     <w:nsid w:val="7CBC024B"/>
     <w:multiLevelType w:val="hybridMultilevel"/>
     <w:tmpl w:val="51DAA166"/>
@@ -9174,148 +9886,157 @@
     </w:lvl>
   </w:abstractNum>
   <w:num w:numId="1" w16cid:durableId="1430462640">
-    <w:abstractNumId w:val="24"/>
+    <w:abstractNumId w:val="27"/>
   </w:num>
   <w:num w:numId="2" w16cid:durableId="1573853060">
+    <w:abstractNumId w:val="35"/>
+  </w:num>
+  <w:num w:numId="3" w16cid:durableId="1959026861">
+    <w:abstractNumId w:val="17"/>
+  </w:num>
+  <w:num w:numId="4" w16cid:durableId="1531601676">
+    <w:abstractNumId w:val="46"/>
+  </w:num>
+  <w:num w:numId="5" w16cid:durableId="482742271">
     <w:abstractNumId w:val="32"/>
   </w:num>
-  <w:num w:numId="3" w16cid:durableId="1959026861">
+  <w:num w:numId="6" w16cid:durableId="1167018715">
+    <w:abstractNumId w:val="45"/>
+  </w:num>
+  <w:num w:numId="7" w16cid:durableId="1595239886">
+    <w:abstractNumId w:val="19"/>
+  </w:num>
+  <w:num w:numId="8" w16cid:durableId="1893032010">
+    <w:abstractNumId w:val="44"/>
+  </w:num>
+  <w:num w:numId="9" w16cid:durableId="1832868777">
+    <w:abstractNumId w:val="43"/>
+  </w:num>
+  <w:num w:numId="10" w16cid:durableId="112480050">
+    <w:abstractNumId w:val="41"/>
+  </w:num>
+  <w:num w:numId="11" w16cid:durableId="543366992">
+    <w:abstractNumId w:val="10"/>
+  </w:num>
+  <w:num w:numId="12" w16cid:durableId="1966276689">
+    <w:abstractNumId w:val="16"/>
+  </w:num>
+  <w:num w:numId="13" w16cid:durableId="2109889615">
+    <w:abstractNumId w:val="6"/>
+  </w:num>
+  <w:num w:numId="14" w16cid:durableId="1523084151">
+    <w:abstractNumId w:val="38"/>
+  </w:num>
+  <w:num w:numId="15" w16cid:durableId="889926831">
+    <w:abstractNumId w:val="21"/>
+  </w:num>
+  <w:num w:numId="16" w16cid:durableId="301934203">
+    <w:abstractNumId w:val="47"/>
+  </w:num>
+  <w:num w:numId="17" w16cid:durableId="2052728335">
+    <w:abstractNumId w:val="34"/>
+  </w:num>
+  <w:num w:numId="18" w16cid:durableId="932326246">
+    <w:abstractNumId w:val="11"/>
+  </w:num>
+  <w:num w:numId="19" w16cid:durableId="71045595">
+    <w:abstractNumId w:val="29"/>
+  </w:num>
+  <w:num w:numId="20" w16cid:durableId="115608834">
     <w:abstractNumId w:val="14"/>
   </w:num>
-  <w:num w:numId="4" w16cid:durableId="1531601676">
-    <w:abstractNumId w:val="43"/>
+  <w:num w:numId="21" w16cid:durableId="1754931694">
+    <w:abstractNumId w:val="48"/>
   </w:num>
-  <w:num w:numId="5" w16cid:durableId="482742271">
-    <w:abstractNumId w:val="29"/>
-  </w:num>
-  <w:num w:numId="6" w16cid:durableId="1167018715">
-    <w:abstractNumId w:val="42"/>
-  </w:num>
-  <w:num w:numId="7" w16cid:durableId="1595239886">
-    <w:abstractNumId w:val="16"/>
-  </w:num>
-  <w:num w:numId="8" w16cid:durableId="1893032010">
-    <w:abstractNumId w:val="41"/>
-  </w:num>
-  <w:num w:numId="9" w16cid:durableId="1832868777">
-    <w:abstractNumId w:val="40"/>
-  </w:num>
-  <w:num w:numId="10" w16cid:durableId="112480050">
-    <w:abstractNumId w:val="38"/>
-  </w:num>
-  <w:num w:numId="11" w16cid:durableId="543366992">
-    <w:abstractNumId w:val="7"/>
-  </w:num>
-  <w:num w:numId="12" w16cid:durableId="1966276689">
-    <w:abstractNumId w:val="13"/>
-  </w:num>
-  <w:num w:numId="13" w16cid:durableId="2109889615">
-    <w:abstractNumId w:val="5"/>
-  </w:num>
-  <w:num w:numId="14" w16cid:durableId="1523084151">
-    <w:abstractNumId w:val="35"/>
-  </w:num>
-  <w:num w:numId="15" w16cid:durableId="889926831">
-    <w:abstractNumId w:val="18"/>
-  </w:num>
-  <w:num w:numId="16" w16cid:durableId="301934203">
-    <w:abstractNumId w:val="44"/>
-  </w:num>
-  <w:num w:numId="17" w16cid:durableId="2052728335">
+  <w:num w:numId="22" w16cid:durableId="1223179733">
     <w:abstractNumId w:val="31"/>
   </w:num>
-  <w:num w:numId="18" w16cid:durableId="932326246">
+  <w:num w:numId="23" w16cid:durableId="1342194663">
+    <w:abstractNumId w:val="25"/>
+  </w:num>
+  <w:num w:numId="24" w16cid:durableId="1493138144">
+    <w:abstractNumId w:val="22"/>
+  </w:num>
+  <w:num w:numId="25" w16cid:durableId="1716395093">
+    <w:abstractNumId w:val="12"/>
+  </w:num>
+  <w:num w:numId="26" w16cid:durableId="1834223278">
+    <w:abstractNumId w:val="49"/>
+  </w:num>
+  <w:num w:numId="27" w16cid:durableId="1622497042">
+    <w:abstractNumId w:val="4"/>
+  </w:num>
+  <w:num w:numId="28" w16cid:durableId="1713577368">
     <w:abstractNumId w:val="8"/>
   </w:num>
-  <w:num w:numId="19" w16cid:durableId="71045595">
-    <w:abstractNumId w:val="26"/>
-  </w:num>
-  <w:num w:numId="20" w16cid:durableId="115608834">
-    <w:abstractNumId w:val="11"/>
-  </w:num>
-  <w:num w:numId="21" w16cid:durableId="1754931694">
-    <w:abstractNumId w:val="45"/>
-  </w:num>
-  <w:num w:numId="22" w16cid:durableId="1223179733">
-    <w:abstractNumId w:val="28"/>
-  </w:num>
-  <w:num w:numId="23" w16cid:durableId="1342194663">
-    <w:abstractNumId w:val="22"/>
-  </w:num>
-  <w:num w:numId="24" w16cid:durableId="1493138144">
-    <w:abstractNumId w:val="19"/>
-  </w:num>
-  <w:num w:numId="25" w16cid:durableId="1716395093">
-    <w:abstractNumId w:val="9"/>
-  </w:num>
-  <w:num w:numId="26" w16cid:durableId="1834223278">
-    <w:abstractNumId w:val="46"/>
-  </w:num>
-  <w:num w:numId="27" w16cid:durableId="1622497042">
-    <w:abstractNumId w:val="3"/>
-  </w:num>
-  <w:num w:numId="28" w16cid:durableId="1713577368">
-    <w:abstractNumId w:val="6"/>
-  </w:num>
   <w:num w:numId="29" w16cid:durableId="1729259035">
-    <w:abstractNumId w:val="34"/>
+    <w:abstractNumId w:val="37"/>
   </w:num>
   <w:num w:numId="30" w16cid:durableId="526063690">
-    <w:abstractNumId w:val="25"/>
+    <w:abstractNumId w:val="28"/>
   </w:num>
   <w:num w:numId="31" w16cid:durableId="1001661738">
     <w:abstractNumId w:val="0"/>
   </w:num>
   <w:num w:numId="32" w16cid:durableId="1969435536">
-    <w:abstractNumId w:val="37"/>
+    <w:abstractNumId w:val="40"/>
   </w:num>
   <w:num w:numId="33" w16cid:durableId="1673296386">
-    <w:abstractNumId w:val="47"/>
+    <w:abstractNumId w:val="50"/>
   </w:num>
   <w:num w:numId="34" w16cid:durableId="43987462">
-    <w:abstractNumId w:val="23"/>
+    <w:abstractNumId w:val="26"/>
   </w:num>
   <w:num w:numId="35" w16cid:durableId="1996178570">
-    <w:abstractNumId w:val="17"/>
+    <w:abstractNumId w:val="20"/>
   </w:num>
   <w:num w:numId="36" w16cid:durableId="924612152">
     <w:abstractNumId w:val="1"/>
   </w:num>
   <w:num w:numId="37" w16cid:durableId="1724215571">
-    <w:abstractNumId w:val="27"/>
+    <w:abstractNumId w:val="30"/>
   </w:num>
   <w:num w:numId="38" w16cid:durableId="77338092">
-    <w:abstractNumId w:val="15"/>
+    <w:abstractNumId w:val="18"/>
   </w:num>
   <w:num w:numId="39" w16cid:durableId="1913158407">
-    <w:abstractNumId w:val="4"/>
+    <w:abstractNumId w:val="5"/>
   </w:num>
   <w:num w:numId="40" w16cid:durableId="360355">
-    <w:abstractNumId w:val="36"/>
+    <w:abstractNumId w:val="39"/>
   </w:num>
   <w:num w:numId="41" w16cid:durableId="2132167177">
     <w:abstractNumId w:val="2"/>
   </w:num>
   <w:num w:numId="42" w16cid:durableId="1521581085">
-    <w:abstractNumId w:val="21"/>
+    <w:abstractNumId w:val="24"/>
   </w:num>
   <w:num w:numId="43" w16cid:durableId="942300271">
+    <w:abstractNumId w:val="36"/>
+  </w:num>
+  <w:num w:numId="44" w16cid:durableId="841555628">
     <w:abstractNumId w:val="33"/>
   </w:num>
-  <w:num w:numId="44" w16cid:durableId="841555628">
-    <w:abstractNumId w:val="30"/>
-  </w:num>
   <w:num w:numId="45" w16cid:durableId="207039101">
-    <w:abstractNumId w:val="10"/>
+    <w:abstractNumId w:val="13"/>
   </w:num>
   <w:num w:numId="46" w16cid:durableId="879627357">
-    <w:abstractNumId w:val="39"/>
+    <w:abstractNumId w:val="42"/>
   </w:num>
   <w:num w:numId="47" w16cid:durableId="78910873">
-    <w:abstractNumId w:val="20"/>
+    <w:abstractNumId w:val="23"/>
   </w:num>
   <w:num w:numId="48" w16cid:durableId="2059666349">
-    <w:abstractNumId w:val="12"/>
+    <w:abstractNumId w:val="15"/>
+  </w:num>
+  <w:num w:numId="49" w16cid:durableId="1081948357">
+    <w:abstractNumId w:val="3"/>
+  </w:num>
+  <w:num w:numId="50" w16cid:durableId="3673169">
+    <w:abstractNumId w:val="7"/>
+  </w:num>
+  <w:num w:numId="51" w16cid:durableId="460656140">
+    <w:abstractNumId w:val="9"/>
   </w:num>
 </w:numbering>
 </file>
@@ -10061,6 +10782,33 @@
       <w:rFonts w:ascii="Calibri" w:eastAsia="Calibri" w:hAnsi="Calibri" w:cs="Calibri"/>
     </w:rPr>
   </w:style>
+  <w:style w:type="paragraph" w:styleId="NormalWeb">
+    <w:name w:val="Normal (Web)"/>
+    <w:basedOn w:val="Normal"/>
+    <w:uiPriority w:val="99"/>
+    <w:unhideWhenUsed/>
+    <w:rsid w:val="0038711E"/>
+    <w:pPr>
+      <w:spacing w:before="100" w:beforeAutospacing="1" w:after="100" w:afterAutospacing="1"/>
+    </w:pPr>
+    <w:rPr>
+      <w:rFonts w:ascii="Times New Roman" w:eastAsia="Times New Roman" w:hAnsi="Times New Roman" w:cs="Times New Roman"/>
+      <w:sz w:val="24"/>
+      <w:szCs w:val="24"/>
+      <w:lang w:bidi="bn-BD"/>
+    </w:rPr>
+  </w:style>
+  <w:style w:type="character" w:styleId="Strong">
+    <w:name w:val="Strong"/>
+    <w:basedOn w:val="DefaultParagraphFont"/>
+    <w:uiPriority w:val="22"/>
+    <w:qFormat/>
+    <w:rsid w:val="0038711E"/>
+    <w:rPr>
+      <w:b/>
+      <w:bCs/>
+    </w:rPr>
+  </w:style>
 </w:styles>
 </file>
 
@@ -10400,28 +11148,6 @@
 </file>
 
 <file path=customXml/item1.xml><?xml version="1.0" encoding="utf-8"?>
-<b:Sources xmlns:b="http://schemas.openxmlformats.org/officeDocument/2006/bibliography" xmlns="http://schemas.openxmlformats.org/officeDocument/2006/bibliography" SelectedStyle="\APASixthEditionOfficeOnline.xsl" StyleName="APA" Version="6"/>
-</file>
-
-<file path=customXml/item2.xml><?xml version="1.0" encoding="utf-8"?>
-<?mso-contentType ?>
-<FormTemplates xmlns="http://schemas.microsoft.com/sharepoint/v3/contenttype/forms">
-  <Display>DocumentLibraryForm</Display>
-  <Edit>DocumentLibraryForm</Edit>
-  <New>DocumentLibraryForm</New>
-</FormTemplates>
-</file>
-
-<file path=customXml/item3.xml><?xml version="1.0" encoding="utf-8"?>
-<p:properties xmlns:p="http://schemas.microsoft.com/office/2006/metadata/properties" xmlns:xsi="http://www.w3.org/2001/XMLSchema-instance" xmlns:pc="http://schemas.microsoft.com/office/infopath/2007/PartnerControls">
-  <documentManagement>
-    <_ip_UnifiedCompliancePolicyUIAction xmlns="http://schemas.microsoft.com/sharepoint/v3" xsi:nil="true"/>
-    <_ip_UnifiedCompliancePolicyProperties xmlns="http://schemas.microsoft.com/sharepoint/v3" xsi:nil="true"/>
-  </documentManagement>
-</p:properties>
-</file>
-
-<file path=customXml/item4.xml><?xml version="1.0" encoding="utf-8"?>
 <ct:contentTypeSchema xmlns:ct="http://schemas.microsoft.com/office/2006/metadata/contentType" xmlns:ma="http://schemas.microsoft.com/office/2006/metadata/properties/metaAttributes" ct:_="" ma:_="" ma:contentTypeName="Document" ma:contentTypeID="0x0101003C7E18303F841E4396D5FD068880D5D3" ma:contentTypeVersion="16" ma:contentTypeDescription="Create a new document." ma:contentTypeScope="" ma:versionID="481bb1a4332af3889a7ecc17e1abcbf3">
   <xsd:schema xmlns:xsd="http://www.w3.org/2001/XMLSchema" xmlns:xs="http://www.w3.org/2001/XMLSchema" xmlns:p="http://schemas.microsoft.com/office/2006/metadata/properties" xmlns:ns1="http://schemas.microsoft.com/sharepoint/v3" xmlns:ns2="a64c34e4-9fca-4d45-92d3-78fdd6d0542b" xmlns:ns3="52da1144-a761-4d48-9b89-d9f53447ebd2" targetNamespace="http://schemas.microsoft.com/office/2006/metadata/properties" ma:root="true" ma:fieldsID="8865ff7fa4f1c40d080b337996aaf0bd" ns1:_="" ns2:_="" ns3:_="">
     <xsd:import namespace="http://schemas.microsoft.com/sharepoint/v3"/>
@@ -10661,33 +11387,29 @@
 </ct:contentTypeSchema>
 </file>
 
-<file path=customXml/itemProps1.xml><?xml version="1.0" encoding="utf-8"?>
-<ds:datastoreItem xmlns:ds="http://schemas.openxmlformats.org/officeDocument/2006/customXml" ds:itemID="{94EF51D2-543D-487D-A5F8-7F6DE96BEF05}">
-  <ds:schemaRefs>
-    <ds:schemaRef ds:uri="http://schemas.openxmlformats.org/officeDocument/2006/bibliography"/>
-  </ds:schemaRefs>
-</ds:datastoreItem>
+<file path=customXml/item2.xml><?xml version="1.0" encoding="utf-8"?>
+<b:Sources xmlns:b="http://schemas.openxmlformats.org/officeDocument/2006/bibliography" xmlns="http://schemas.openxmlformats.org/officeDocument/2006/bibliography" SelectedStyle="\APASixthEditionOfficeOnline.xsl" StyleName="APA" Version="6"/>
 </file>
 
-<file path=customXml/itemProps2.xml><?xml version="1.0" encoding="utf-8"?>
-<ds:datastoreItem xmlns:ds="http://schemas.openxmlformats.org/officeDocument/2006/customXml" ds:itemID="{4E8B984F-FFA9-4980-B3D9-257B0B40EA87}">
-  <ds:schemaRefs>
-    <ds:schemaRef ds:uri="http://schemas.microsoft.com/sharepoint/v3/contenttype/forms"/>
-  </ds:schemaRefs>
-</ds:datastoreItem>
+<file path=customXml/item3.xml><?xml version="1.0" encoding="utf-8"?>
+<?mso-contentType ?>
+<FormTemplates xmlns="http://schemas.microsoft.com/sharepoint/v3/contenttype/forms">
+  <Display>DocumentLibraryForm</Display>
+  <Edit>DocumentLibraryForm</Edit>
+  <New>DocumentLibraryForm</New>
+</FormTemplates>
 </file>
 
-<file path=customXml/itemProps3.xml><?xml version="1.0" encoding="utf-8"?>
-<ds:datastoreItem xmlns:ds="http://schemas.openxmlformats.org/officeDocument/2006/customXml" ds:itemID="{93BDEE00-7A85-4E61-B7E5-34AB3BBCBAF5}">
-  <ds:schemaRefs>
-    <ds:schemaRef ds:uri="http://schemas.microsoft.com/office/2006/metadata/properties"/>
-    <ds:schemaRef ds:uri="http://schemas.microsoft.com/office/infopath/2007/PartnerControls"/>
-    <ds:schemaRef ds:uri="http://schemas.microsoft.com/sharepoint/v3"/>
-  </ds:schemaRefs>
-</ds:datastoreItem>
+<file path=customXml/item4.xml><?xml version="1.0" encoding="utf-8"?>
+<p:properties xmlns:p="http://schemas.microsoft.com/office/2006/metadata/properties" xmlns:xsi="http://www.w3.org/2001/XMLSchema-instance" xmlns:pc="http://schemas.microsoft.com/office/infopath/2007/PartnerControls">
+  <documentManagement>
+    <_ip_UnifiedCompliancePolicyUIAction xmlns="http://schemas.microsoft.com/sharepoint/v3" xsi:nil="true"/>
+    <_ip_UnifiedCompliancePolicyProperties xmlns="http://schemas.microsoft.com/sharepoint/v3" xsi:nil="true"/>
+  </documentManagement>
+</p:properties>
 </file>
 
-<file path=customXml/itemProps4.xml><?xml version="1.0" encoding="utf-8"?>
+<file path=customXml/itemProps1.xml><?xml version="1.0" encoding="utf-8"?>
 <ds:datastoreItem xmlns:ds="http://schemas.openxmlformats.org/officeDocument/2006/customXml" ds:itemID="{536B8056-A6F8-4EC0-902C-54819F9B4614}">
   <ds:schemaRefs>
     <ds:schemaRef ds:uri="http://schemas.microsoft.com/office/2006/metadata/contentType"/>
@@ -10705,4 +11427,30 @@
     <ds:schemaRef ds:uri="http://schemas.microsoft.com/internal/obd"/>
   </ds:schemaRefs>
 </ds:datastoreItem>
+</file>
+
+<file path=customXml/itemProps2.xml><?xml version="1.0" encoding="utf-8"?>
+<ds:datastoreItem xmlns:ds="http://schemas.openxmlformats.org/officeDocument/2006/customXml" ds:itemID="{94EF51D2-543D-487D-A5F8-7F6DE96BEF05}">
+  <ds:schemaRefs>
+    <ds:schemaRef ds:uri="http://schemas.openxmlformats.org/officeDocument/2006/bibliography"/>
+  </ds:schemaRefs>
+</ds:datastoreItem>
+</file>
+
+<file path=customXml/itemProps3.xml><?xml version="1.0" encoding="utf-8"?>
+<ds:datastoreItem xmlns:ds="http://schemas.openxmlformats.org/officeDocument/2006/customXml" ds:itemID="{4E8B984F-FFA9-4980-B3D9-257B0B40EA87}">
+  <ds:schemaRefs>
+    <ds:schemaRef ds:uri="http://schemas.microsoft.com/sharepoint/v3/contenttype/forms"/>
+  </ds:schemaRefs>
+</ds:datastoreItem>
+</file>
+
+<file path=customXml/itemProps4.xml><?xml version="1.0" encoding="utf-8"?>
+<ds:datastoreItem xmlns:ds="http://schemas.openxmlformats.org/officeDocument/2006/customXml" ds:itemID="{93BDEE00-7A85-4E61-B7E5-34AB3BBCBAF5}">
+  <ds:schemaRefs>
+    <ds:schemaRef ds:uri="http://schemas.microsoft.com/office/2006/metadata/properties"/>
+    <ds:schemaRef ds:uri="http://schemas.microsoft.com/office/infopath/2007/PartnerControls"/>
+    <ds:schemaRef ds:uri="http://schemas.microsoft.com/sharepoint/v3"/>
+  </ds:schemaRefs>
+</ds:datastoreItem>
 </file>
</xml_diff>